<commit_message>
Updated Docs Rev. 3
</commit_message>
<xml_diff>
--- a/PET_Diagnostic_Clip/Rev. 3/text/PETDiagClip_Testing.docx
+++ b/PET_Diagnostic_Clip/Rev. 3/text/PETDiagClip_Testing.docx
@@ -1,72 +1,60 @@
 
 <file path=word/document.xml><?xml version="1.0" encoding="utf-8"?>
-<w:document xmlns:o="urn:schemas-microsoft-com:office:office" xmlns:r="http://schemas.openxmlformats.org/officeDocument/2006/relationships" xmlns:v="urn:schemas-microsoft-com:vml" xmlns:w="http://schemas.openxmlformats.org/wordprocessingml/2006/main" xmlns:w10="urn:schemas-microsoft-com:office:word" xmlns:wp="http://schemas.openxmlformats.org/drawingml/2006/wordprocessingDrawing" xmlns:pic="http://schemas.openxmlformats.org/drawingml/2006/picture" xmlns:wps="http://schemas.microsoft.com/office/word/2010/wordprocessingShape" xmlns:wpg="http://schemas.microsoft.com/office/word/2010/wordprocessingGroup" xmlns:mc="http://schemas.openxmlformats.org/markup-compatibility/2006" xmlns:wp14="http://schemas.microsoft.com/office/word/2010/wordprocessingDrawing" xmlns:w14="http://schemas.microsoft.com/office/word/2010/wordml" xmlns:w15="http://schemas.microsoft.com/office/word/2012/wordml" mc:Ignorable="w14 wp14 w15">
+<w:document xmlns:wpc="http://schemas.microsoft.com/office/word/2010/wordprocessingCanvas" xmlns:cx="http://schemas.microsoft.com/office/drawing/2014/chartex" xmlns:cx1="http://schemas.microsoft.com/office/drawing/2015/9/8/chartex" xmlns:cx2="http://schemas.microsoft.com/office/drawing/2015/10/21/chartex" xmlns:cx3="http://schemas.microsoft.com/office/drawing/2016/5/9/chartex" xmlns:cx4="http://schemas.microsoft.com/office/drawing/2016/5/10/chartex" xmlns:cx5="http://schemas.microsoft.com/office/drawing/2016/5/11/chartex" xmlns:cx6="http://schemas.microsoft.com/office/drawing/2016/5/12/chartex" xmlns:cx7="http://schemas.microsoft.com/office/drawing/2016/5/13/chartex" xmlns:cx8="http://schemas.microsoft.com/office/drawing/2016/5/14/chartex" xmlns:mc="http://schemas.openxmlformats.org/markup-compatibility/2006" xmlns:aink="http://schemas.microsoft.com/office/drawing/2016/ink" xmlns:am3d="http://schemas.microsoft.com/office/drawing/2017/model3d" xmlns:o="urn:schemas-microsoft-com:office:office" xmlns:oel="http://schemas.microsoft.com/office/2019/extlst" xmlns:r="http://schemas.openxmlformats.org/officeDocument/2006/relationships" xmlns:m="http://schemas.openxmlformats.org/officeDocument/2006/math" xmlns:v="urn:schemas-microsoft-com:vml" xmlns:wp14="http://schemas.microsoft.com/office/word/2010/wordprocessingDrawing" xmlns:wp="http://schemas.openxmlformats.org/drawingml/2006/wordprocessingDrawing" xmlns:w10="urn:schemas-microsoft-com:office:word" xmlns:w="http://schemas.openxmlformats.org/wordprocessingml/2006/main" xmlns:w14="http://schemas.microsoft.com/office/word/2010/wordml" xmlns:w15="http://schemas.microsoft.com/office/word/2012/wordml" xmlns:w16cex="http://schemas.microsoft.com/office/word/2018/wordml/cex" xmlns:w16cid="http://schemas.microsoft.com/office/word/2016/wordml/cid" xmlns:w16="http://schemas.microsoft.com/office/word/2018/wordml" xmlns:w16du="http://schemas.microsoft.com/office/word/2023/wordml/word16du" xmlns:w16sdtdh="http://schemas.microsoft.com/office/word/2020/wordml/sdtdatahash" xmlns:w16sdtfl="http://schemas.microsoft.com/office/word/2024/wordml/sdtformatlock" xmlns:w16se="http://schemas.microsoft.com/office/word/2015/wordml/symex" xmlns:wpg="http://schemas.microsoft.com/office/word/2010/wordprocessingGroup" xmlns:wpi="http://schemas.microsoft.com/office/word/2010/wordprocessingInk" xmlns:wne="http://schemas.microsoft.com/office/word/2006/wordml" xmlns:wps="http://schemas.microsoft.com/office/word/2010/wordprocessingShape" mc:Ignorable="w14 w15 w16se w16cid w16 w16cex w16sdtdh w16sdtfl w16du wp14">
   <w:body>
     <w:p>
       <w:pPr>
         <w:pStyle w:val="DokumentTitel"/>
         <w:rPr>
-          <w:rStyle w:val="BookTitle"/>
+          <w:rStyle w:val="Buchtitel"/>
           <w:b/>
-          <w:bCs w:val="false"/>
-          <w:i w:val="false"/>
-          <w:iCs w:val="false"/>
-          <w:lang w:val="en-US"/>
-        </w:rPr>
-      </w:pPr>
-      <w:r>
-        <w:rPr>
-          <w:rStyle w:val="BookTitle"/>
-          <w:b w:val="false"/>
-          <w:bCs w:val="false"/>
-          <w:i w:val="false"/>
-          <w:iCs w:val="false"/>
+          <w:bCs w:val="0"/>
+          <w:i w:val="0"/>
+          <w:iCs w:val="0"/>
+          <w:lang w:val="en-US"/>
+        </w:rPr>
+      </w:pPr>
+      <w:r>
+        <w:rPr>
+          <w:rStyle w:val="Buchtitel"/>
+          <w:bCs w:val="0"/>
+          <w:i w:val="0"/>
+          <w:iCs w:val="0"/>
           <w:lang w:val="en-US"/>
         </w:rPr>
         <w:t>Commodore PET/CBM80xx/40xx Diagnostic Clip</w:t>
       </w:r>
       <w:r>
         <w:rPr>
-          <w:rStyle w:val="BookTitle"/>
+          <w:rStyle w:val="Buchtitel"/>
           <w:b/>
-          <w:bCs w:val="false"/>
-          <w:i w:val="false"/>
-          <w:iCs w:val="false"/>
-          <w:lang w:val="en-US"/>
-        </w:rPr>
-        <w:t xml:space="preserve"> Rev. </w:t>
-      </w:r>
-      <w:r>
-        <w:rPr>
-          <w:rStyle w:val="BookTitle"/>
+          <w:bCs w:val="0"/>
+          <w:i w:val="0"/>
+          <w:iCs w:val="0"/>
+          <w:lang w:val="en-US"/>
+        </w:rPr>
+        <w:t xml:space="preserve"> Rev. 3</w:t>
+      </w:r>
+    </w:p>
+    <w:p>
+      <w:pPr>
+        <w:pStyle w:val="DokumentTitel"/>
+        <w:rPr>
+          <w:rStyle w:val="Buchtitel"/>
           <w:b/>
-          <w:bCs w:val="false"/>
-          <w:i w:val="false"/>
-          <w:iCs w:val="false"/>
-          <w:lang w:val="en-US"/>
-        </w:rPr>
-        <w:t>3</w:t>
-      </w:r>
-    </w:p>
-    <w:p>
-      <w:pPr>
-        <w:pStyle w:val="DokumentTitel"/>
-        <w:rPr>
-          <w:rStyle w:val="BookTitle"/>
+          <w:bCs w:val="0"/>
+          <w:i w:val="0"/>
+          <w:iCs w:val="0"/>
+          <w:lang w:val="en-US"/>
+        </w:rPr>
+      </w:pPr>
+      <w:r>
+        <w:rPr>
+          <w:rStyle w:val="Buchtitel"/>
           <w:b/>
-          <w:bCs w:val="false"/>
-          <w:i w:val="false"/>
-          <w:iCs w:val="false"/>
-          <w:lang w:val="en-US"/>
-        </w:rPr>
-      </w:pPr>
-      <w:r>
-        <w:rPr>
-          <w:rStyle w:val="BookTitle"/>
-          <w:b/>
-          <w:bCs w:val="false"/>
-          <w:i w:val="false"/>
-          <w:iCs w:val="false"/>
+          <w:bCs w:val="0"/>
+          <w:i w:val="0"/>
+          <w:iCs w:val="0"/>
           <w:lang w:val="en-US"/>
         </w:rPr>
         <w:t>Testing</w:t>
@@ -74,23 +62,23 @@
     </w:p>
     <w:p>
       <w:pPr>
-        <w:pStyle w:val="Heading1"/>
-        <w:rPr>
-          <w:rStyle w:val="BookTitle"/>
-          <w:b w:val="false"/>
-          <w:bCs w:val="false"/>
-          <w:i w:val="false"/>
-          <w:iCs w:val="false"/>
-          <w:lang w:val="en-US"/>
-        </w:rPr>
-      </w:pPr>
-      <w:r>
-        <w:rPr>
-          <w:rStyle w:val="BookTitle"/>
-          <w:b w:val="false"/>
-          <w:bCs w:val="false"/>
-          <w:i w:val="false"/>
-          <w:iCs w:val="false"/>
+        <w:pStyle w:val="berschrift1"/>
+        <w:rPr>
+          <w:rStyle w:val="Buchtitel"/>
+          <w:b w:val="0"/>
+          <w:bCs w:val="0"/>
+          <w:i w:val="0"/>
+          <w:iCs w:val="0"/>
+          <w:lang w:val="en-US"/>
+        </w:rPr>
+      </w:pPr>
+      <w:r>
+        <w:rPr>
+          <w:rStyle w:val="Buchtitel"/>
+          <w:b w:val="0"/>
+          <w:bCs w:val="0"/>
+          <w:i w:val="0"/>
+          <w:iCs w:val="0"/>
           <w:lang w:val="en-US"/>
         </w:rPr>
         <w:t>Test Setup</w:t>
@@ -98,7 +86,6 @@
     </w:p>
     <w:p>
       <w:pPr>
-        <w:pStyle w:val="Normal"/>
         <w:rPr>
           <w:lang w:val="en-US"/>
         </w:rPr>
@@ -112,7 +99,7 @@
     </w:p>
     <w:p>
       <w:pPr>
-        <w:pStyle w:val="ListParagraph"/>
+        <w:pStyle w:val="Listenabsatz"/>
         <w:numPr>
           <w:ilvl w:val="0"/>
           <w:numId w:val="1"/>
@@ -125,18 +112,12 @@
         <w:rPr>
           <w:lang w:val="en-US"/>
         </w:rPr>
-        <w:t xml:space="preserve">Diagnostic Clip Rev. </w:t>
-      </w:r>
-      <w:r>
-        <w:rPr>
-          <w:lang w:val="en-US"/>
-        </w:rPr>
-        <w:t>3</w:t>
-      </w:r>
-    </w:p>
-    <w:p>
-      <w:pPr>
-        <w:pStyle w:val="ListParagraph"/>
+        <w:t>Diagnostic Clip Rev. 3</w:t>
+      </w:r>
+    </w:p>
+    <w:p>
+      <w:pPr>
+        <w:pStyle w:val="Listenabsatz"/>
         <w:numPr>
           <w:ilvl w:val="0"/>
           <w:numId w:val="1"/>
@@ -154,7 +135,7 @@
     </w:p>
     <w:p>
       <w:pPr>
-        <w:pStyle w:val="ListParagraph"/>
+        <w:pStyle w:val="Listenabsatz"/>
         <w:numPr>
           <w:ilvl w:val="0"/>
           <w:numId w:val="1"/>
@@ -172,7 +153,7 @@
     </w:p>
     <w:p>
       <w:pPr>
-        <w:pStyle w:val="ListParagraph"/>
+        <w:pStyle w:val="Listenabsatz"/>
         <w:numPr>
           <w:ilvl w:val="0"/>
           <w:numId w:val="1"/>
@@ -190,7 +171,7 @@
     </w:p>
     <w:p>
       <w:pPr>
-        <w:pStyle w:val="ListParagraph"/>
+        <w:pStyle w:val="Listenabsatz"/>
         <w:numPr>
           <w:ilvl w:val="0"/>
           <w:numId w:val="1"/>
@@ -208,7 +189,7 @@
     </w:p>
     <w:p>
       <w:pPr>
-        <w:pStyle w:val="ListParagraph"/>
+        <w:pStyle w:val="Listenabsatz"/>
         <w:numPr>
           <w:ilvl w:val="0"/>
           <w:numId w:val="1"/>
@@ -226,7 +207,7 @@
     </w:p>
     <w:p>
       <w:pPr>
-        <w:pStyle w:val="ListParagraph"/>
+        <w:pStyle w:val="Listenabsatz"/>
         <w:numPr>
           <w:ilvl w:val="0"/>
           <w:numId w:val="1"/>
@@ -244,7 +225,6 @@
     </w:p>
     <w:p>
       <w:pPr>
-        <w:pStyle w:val="Normal"/>
         <w:jc w:val="both"/>
         <w:rPr>
           <w:lang w:val="en-US"/>
@@ -259,7 +239,6 @@
     </w:p>
     <w:p>
       <w:pPr>
-        <w:pStyle w:val="Normal"/>
         <w:jc w:val="both"/>
         <w:rPr>
           <w:lang w:val="en-US"/>
@@ -274,7 +253,6 @@
     </w:p>
     <w:p>
       <w:pPr>
-        <w:pStyle w:val="Normal"/>
         <w:jc w:val="both"/>
         <w:rPr>
           <w:lang w:val="en-US"/>
@@ -289,7 +267,6 @@
     </w:p>
     <w:p>
       <w:pPr>
-        <w:pStyle w:val="Normal"/>
         <w:jc w:val="both"/>
         <w:rPr>
           <w:lang w:val="en-US"/>
@@ -304,7 +281,6 @@
     </w:p>
     <w:p>
       <w:pPr>
-        <w:pStyle w:val="Normal"/>
         <w:jc w:val="both"/>
         <w:rPr>
           <w:lang w:val="en-US"/>
@@ -314,22 +290,36 @@
         <w:rPr>
           <w:lang w:val="en-US"/>
         </w:rPr>
-        <w:t>Later, the diagnostic box was connected to the ribbon cable, the keyboard and the user port dongle were connected to the respective connector of the main board. The IEEE-488 interface was open, the cassette port was not connected to a Datassette.</w:t>
-      </w:r>
-    </w:p>
-    <w:p>
-      <w:pPr>
-        <w:pStyle w:val="Normal"/>
-        <w:keepNext w:val="true"/>
+        <w:t xml:space="preserve">Later, the diagnostic box was connected to the ribbon cable, the keyboard and the user port dongle were connected to the respective connector of the main board. The IEEE-488 interface was open, the cassette port was not connected to a </w:t>
+      </w:r>
+      <w:proofErr w:type="spellStart"/>
+      <w:r>
+        <w:rPr>
+          <w:lang w:val="en-US"/>
+        </w:rPr>
+        <w:t>Datassette</w:t>
+      </w:r>
+      <w:proofErr w:type="spellEnd"/>
+      <w:r>
+        <w:rPr>
+          <w:lang w:val="en-US"/>
+        </w:rPr>
+        <w:t>.</w:t>
+      </w:r>
+    </w:p>
+    <w:p>
+      <w:pPr>
+        <w:keepNext/>
         <w:jc w:val="center"/>
-        <w:rPr/>
-      </w:pPr>
-      <w:r>
-        <w:rPr/>
+      </w:pPr>
+      <w:r>
+        <w:rPr>
+          <w:noProof/>
+        </w:rPr>
         <w:drawing>
-          <wp:inline distT="0" distB="0" distL="0" distR="0">
-            <wp:extent cx="4700270" cy="3524250"/>
-            <wp:effectExtent l="0" t="0" r="0" b="0"/>
+          <wp:inline distT="0" distB="0" distL="0" distR="0" wp14:anchorId="077B2D3D" wp14:editId="5A12FE09">
+            <wp:extent cx="4700270" cy="3131618"/>
+            <wp:effectExtent l="0" t="0" r="5080" b="0"/>
             <wp:docPr id="1" name="Grafik 2"/>
             <wp:cNvGraphicFramePr>
               <a:graphicFrameLocks xmlns:a="http://schemas.openxmlformats.org/drawingml/2006/main" noChangeAspect="1"/>
@@ -344,7 +334,13 @@
                     </pic:cNvPicPr>
                   </pic:nvPicPr>
                   <pic:blipFill>
-                    <a:blip r:embed="rId2"/>
+                    <a:blip r:embed="rId8" cstate="print">
+                      <a:extLst>
+                        <a:ext uri="{28A0092B-C50C-407E-A947-70E740481C1C}">
+                          <a14:useLocalDpi xmlns:a14="http://schemas.microsoft.com/office/drawing/2010/main" val="0"/>
+                        </a:ext>
+                      </a:extLst>
+                    </a:blip>
                     <a:stretch>
                       <a:fillRect/>
                     </a:stretch>
@@ -352,7 +348,7 @@
                   <pic:spPr bwMode="auto">
                     <a:xfrm>
                       <a:off x="0" y="0"/>
-                      <a:ext cx="4700270" cy="3524250"/>
+                      <a:ext cx="4700270" cy="3131618"/>
                     </a:xfrm>
                     <a:prstGeom prst="rect">
                       <a:avLst/>
@@ -368,7 +364,7 @@
     </w:p>
     <w:p>
       <w:pPr>
-        <w:pStyle w:val="Caption"/>
+        <w:pStyle w:val="Beschriftung"/>
         <w:jc w:val="center"/>
         <w:rPr>
           <w:lang w:val="en-US"/>
@@ -400,6 +396,7 @@
       </w:r>
       <w:r>
         <w:rPr>
+          <w:noProof/>
           <w:lang w:val="en-US"/>
         </w:rPr>
         <w:t>1</w:t>
@@ -414,45 +411,28 @@
         <w:rPr>
           <w:lang w:val="en-US"/>
         </w:rPr>
-        <w:t xml:space="preserve">: Testing the Diagnostic Clip </w:t>
-      </w:r>
-      <w:r>
-        <w:rPr>
-          <w:lang w:val="en-US"/>
-        </w:rPr>
-        <w:t xml:space="preserve">(v2) </w:t>
-      </w:r>
-      <w:r>
-        <w:rPr>
-          <w:lang w:val="en-US"/>
-        </w:rPr>
-        <w:t>in the CBM 3016</w:t>
-      </w:r>
-    </w:p>
-    <w:p>
-      <w:pPr>
-        <w:pStyle w:val="Normal"/>
-        <w:rPr>
-          <w:lang w:val="en-US"/>
-        </w:rPr>
-      </w:pPr>
-      <w:r>
-        <w:rPr>
-          <w:lang w:val="en-US"/>
-        </w:rPr>
-      </w:r>
-    </w:p>
-    <w:p>
-      <w:pPr>
-        <w:pStyle w:val="Normal"/>
-        <w:keepNext w:val="true"/>
+        <w:t>: Testing the Diagnostic Clip (v2) in the CBM 3016</w:t>
+      </w:r>
+    </w:p>
+    <w:p>
+      <w:pPr>
+        <w:rPr>
+          <w:lang w:val="en-US"/>
+        </w:rPr>
+      </w:pPr>
+    </w:p>
+    <w:p>
+      <w:pPr>
+        <w:keepNext/>
         <w:jc w:val="center"/>
-        <w:rPr/>
-      </w:pPr>
-      <w:r>
-        <w:rPr/>
+      </w:pPr>
+      <w:r>
+        <w:rPr>
+          <w:noProof/>
+        </w:rPr>
+        <w:lastRenderedPageBreak/>
         <w:drawing>
-          <wp:inline distT="0" distB="0" distL="0" distR="0">
+          <wp:inline distT="0" distB="0" distL="0" distR="0" wp14:anchorId="10FC6543" wp14:editId="3DC584C5">
             <wp:extent cx="4792345" cy="3195955"/>
             <wp:effectExtent l="0" t="0" r="0" b="0"/>
             <wp:docPr id="2" name="Grafik 3"/>
@@ -469,7 +449,7 @@
                     </pic:cNvPicPr>
                   </pic:nvPicPr>
                   <pic:blipFill>
-                    <a:blip r:embed="rId3"/>
+                    <a:blip r:embed="rId9"/>
                     <a:stretch>
                       <a:fillRect/>
                     </a:stretch>
@@ -493,7 +473,7 @@
     </w:p>
     <w:p>
       <w:pPr>
-        <w:pStyle w:val="Caption"/>
+        <w:pStyle w:val="Beschriftung"/>
         <w:jc w:val="center"/>
         <w:rPr>
           <w:lang w:val="en-US"/>
@@ -525,6 +505,7 @@
       </w:r>
       <w:r>
         <w:rPr>
+          <w:noProof/>
           <w:lang w:val="en-US"/>
         </w:rPr>
         <w:t>2</w:t>
@@ -544,7 +525,7 @@
     </w:p>
     <w:p>
       <w:pPr>
-        <w:pStyle w:val="Heading1"/>
+        <w:pStyle w:val="berschrift1"/>
         <w:rPr>
           <w:lang w:val="en-US"/>
         </w:rPr>
@@ -558,7 +539,7 @@
     </w:p>
     <w:p>
       <w:pPr>
-        <w:pStyle w:val="Heading2"/>
+        <w:pStyle w:val="berschrift2"/>
         <w:rPr>
           <w:lang w:val="en-US"/>
         </w:rPr>
@@ -572,7 +553,6 @@
     </w:p>
     <w:p>
       <w:pPr>
-        <w:pStyle w:val="Normal"/>
         <w:jc w:val="both"/>
         <w:rPr>
           <w:lang w:val="en-US"/>
@@ -601,7 +581,7 @@
     </w:p>
     <w:p>
       <w:pPr>
-        <w:pStyle w:val="Heading2"/>
+        <w:pStyle w:val="berschrift2"/>
         <w:rPr>
           <w:lang w:val="en-US"/>
         </w:rPr>
@@ -615,7 +595,6 @@
     </w:p>
     <w:p>
       <w:pPr>
-        <w:pStyle w:val="Normal"/>
         <w:jc w:val="both"/>
         <w:rPr>
           <w:lang w:val="en-US"/>
@@ -630,7 +609,7 @@
     </w:p>
     <w:p>
       <w:pPr>
-        <w:pStyle w:val="ListParagraph"/>
+        <w:pStyle w:val="Listenabsatz"/>
         <w:numPr>
           <w:ilvl w:val="0"/>
           <w:numId w:val="2"/>
@@ -649,7 +628,7 @@
     </w:p>
     <w:p>
       <w:pPr>
-        <w:pStyle w:val="ListParagraph"/>
+        <w:pStyle w:val="Listenabsatz"/>
         <w:numPr>
           <w:ilvl w:val="0"/>
           <w:numId w:val="2"/>
@@ -668,7 +647,7 @@
     </w:p>
     <w:p>
       <w:pPr>
-        <w:pStyle w:val="ListParagraph"/>
+        <w:pStyle w:val="Listenabsatz"/>
         <w:numPr>
           <w:ilvl w:val="0"/>
           <w:numId w:val="2"/>
@@ -687,7 +666,7 @@
     </w:p>
     <w:p>
       <w:pPr>
-        <w:pStyle w:val="Heading1"/>
+        <w:pStyle w:val="berschrift1"/>
         <w:rPr>
           <w:lang w:val="en-US"/>
         </w:rPr>
@@ -701,8 +680,6 @@
     </w:p>
     <w:p>
       <w:pPr>
-        <w:pStyle w:val="Normal"/>
-        <w:spacing w:before="0" w:after="160"/>
         <w:rPr>
           <w:b/>
           <w:bCs/>
@@ -715,44 +692,63 @@
           <w:bCs/>
           <w:lang w:val="en-US"/>
         </w:rPr>
-        <w:t>The Diagnostic Clip, the adapter and the dongles are working properly.</w:t>
+        <w:t>The Diagnostic Clip Rev.3, the adapter and the dongles are working properly.</w:t>
       </w:r>
     </w:p>
     <w:sectPr>
-      <w:footerReference w:type="even" r:id="rId4"/>
-      <w:footerReference w:type="default" r:id="rId5"/>
-      <w:footerReference w:type="first" r:id="rId6"/>
-      <w:type w:val="nextPage"/>
+      <w:footerReference w:type="even" r:id="rId10"/>
+      <w:footerReference w:type="default" r:id="rId11"/>
+      <w:footerReference w:type="first" r:id="rId12"/>
       <w:pgSz w:w="11906" w:h="16838"/>
-      <w:pgMar w:left="1417" w:right="1417" w:gutter="0" w:header="0" w:top="1417" w:footer="708" w:bottom="1134"/>
-      <w:pgNumType w:fmt="decimal"/>
-      <w:formProt w:val="false"/>
-      <w:textDirection w:val="lrTb"/>
-      <w:docGrid w:type="default" w:linePitch="360" w:charSpace="0"/>
+      <w:pgMar w:top="1417" w:right="1417" w:bottom="1134" w:left="1417" w:header="0" w:footer="708" w:gutter="0"/>
+      <w:cols w:space="720"/>
+      <w:formProt w:val="0"/>
+      <w:docGrid w:linePitch="360"/>
     </w:sectPr>
   </w:body>
 </w:document>
 </file>
 
+<file path=word/endnotes.xml><?xml version="1.0" encoding="utf-8"?>
+<w:endnotes xmlns:wpc="http://schemas.microsoft.com/office/word/2010/wordprocessingCanvas" xmlns:cx="http://schemas.microsoft.com/office/drawing/2014/chartex" xmlns:cx1="http://schemas.microsoft.com/office/drawing/2015/9/8/chartex" xmlns:cx2="http://schemas.microsoft.com/office/drawing/2015/10/21/chartex" xmlns:cx3="http://schemas.microsoft.com/office/drawing/2016/5/9/chartex" xmlns:cx4="http://schemas.microsoft.com/office/drawing/2016/5/10/chartex" xmlns:cx5="http://schemas.microsoft.com/office/drawing/2016/5/11/chartex" xmlns:cx6="http://schemas.microsoft.com/office/drawing/2016/5/12/chartex" xmlns:cx7="http://schemas.microsoft.com/office/drawing/2016/5/13/chartex" xmlns:cx8="http://schemas.microsoft.com/office/drawing/2016/5/14/chartex" xmlns:mc="http://schemas.openxmlformats.org/markup-compatibility/2006" xmlns:aink="http://schemas.microsoft.com/office/drawing/2016/ink" xmlns:am3d="http://schemas.microsoft.com/office/drawing/2017/model3d" xmlns:o="urn:schemas-microsoft-com:office:office" xmlns:oel="http://schemas.microsoft.com/office/2019/extlst" xmlns:r="http://schemas.openxmlformats.org/officeDocument/2006/relationships" xmlns:m="http://schemas.openxmlformats.org/officeDocument/2006/math" xmlns:v="urn:schemas-microsoft-com:vml" xmlns:wp14="http://schemas.microsoft.com/office/word/2010/wordprocessingDrawing" xmlns:wp="http://schemas.openxmlformats.org/drawingml/2006/wordprocessingDrawing" xmlns:w10="urn:schemas-microsoft-com:office:word" xmlns:w="http://schemas.openxmlformats.org/wordprocessingml/2006/main" xmlns:w14="http://schemas.microsoft.com/office/word/2010/wordml" xmlns:w15="http://schemas.microsoft.com/office/word/2012/wordml" xmlns:w16cex="http://schemas.microsoft.com/office/word/2018/wordml/cex" xmlns:w16cid="http://schemas.microsoft.com/office/word/2016/wordml/cid" xmlns:w16="http://schemas.microsoft.com/office/word/2018/wordml" xmlns:w16du="http://schemas.microsoft.com/office/word/2023/wordml/word16du" xmlns:w16sdtdh="http://schemas.microsoft.com/office/word/2020/wordml/sdtdatahash" xmlns:w16sdtfl="http://schemas.microsoft.com/office/word/2024/wordml/sdtformatlock" xmlns:w16se="http://schemas.microsoft.com/office/word/2015/wordml/symex" xmlns:wpg="http://schemas.microsoft.com/office/word/2010/wordprocessingGroup" xmlns:wpi="http://schemas.microsoft.com/office/word/2010/wordprocessingInk" xmlns:wne="http://schemas.microsoft.com/office/word/2006/wordml" xmlns:wps="http://schemas.microsoft.com/office/word/2010/wordprocessingShape" mc:Ignorable="w14 w15 w16se w16cid w16 w16cex w16sdtdh w16sdtfl w16du wp14">
+  <w:endnote w:type="separator" w:id="-1">
+    <w:p>
+      <w:pPr>
+        <w:spacing w:after="0" w:line="240" w:lineRule="auto"/>
+      </w:pPr>
+      <w:r>
+        <w:separator/>
+      </w:r>
+    </w:p>
+  </w:endnote>
+  <w:endnote w:type="continuationSeparator" w:id="0">
+    <w:p>
+      <w:pPr>
+        <w:spacing w:after="0" w:line="240" w:lineRule="auto"/>
+      </w:pPr>
+      <w:r>
+        <w:continuationSeparator/>
+      </w:r>
+    </w:p>
+  </w:endnote>
+</w:endnotes>
+</file>
+
 <file path=word/footer1.xml><?xml version="1.0" encoding="utf-8"?>
-<w:ftr xmlns:o="urn:schemas-microsoft-com:office:office" xmlns:r="http://schemas.openxmlformats.org/officeDocument/2006/relationships" xmlns:v="urn:schemas-microsoft-com:vml" xmlns:w="http://schemas.openxmlformats.org/wordprocessingml/2006/main" xmlns:w10="urn:schemas-microsoft-com:office:word" xmlns:wp="http://schemas.openxmlformats.org/drawingml/2006/wordprocessingDrawing" xmlns:pic="http://schemas.openxmlformats.org/drawingml/2006/picture" xmlns:wps="http://schemas.microsoft.com/office/word/2010/wordprocessingShape" xmlns:wpg="http://schemas.microsoft.com/office/word/2010/wordprocessingGroup" xmlns:mc="http://schemas.openxmlformats.org/markup-compatibility/2006" xmlns:wp14="http://schemas.microsoft.com/office/word/2010/wordprocessingDrawing" xmlns:w14="http://schemas.microsoft.com/office/word/2010/wordml" xmlns:w15="http://schemas.microsoft.com/office/word/2012/wordml" mc:Ignorable="w14 wp14 w15">
+<w:ftr xmlns:wpc="http://schemas.microsoft.com/office/word/2010/wordprocessingCanvas" xmlns:cx="http://schemas.microsoft.com/office/drawing/2014/chartex" xmlns:cx1="http://schemas.microsoft.com/office/drawing/2015/9/8/chartex" xmlns:cx2="http://schemas.microsoft.com/office/drawing/2015/10/21/chartex" xmlns:cx3="http://schemas.microsoft.com/office/drawing/2016/5/9/chartex" xmlns:cx4="http://schemas.microsoft.com/office/drawing/2016/5/10/chartex" xmlns:cx5="http://schemas.microsoft.com/office/drawing/2016/5/11/chartex" xmlns:cx6="http://schemas.microsoft.com/office/drawing/2016/5/12/chartex" xmlns:cx7="http://schemas.microsoft.com/office/drawing/2016/5/13/chartex" xmlns:cx8="http://schemas.microsoft.com/office/drawing/2016/5/14/chartex" xmlns:mc="http://schemas.openxmlformats.org/markup-compatibility/2006" xmlns:aink="http://schemas.microsoft.com/office/drawing/2016/ink" xmlns:am3d="http://schemas.microsoft.com/office/drawing/2017/model3d" xmlns:o="urn:schemas-microsoft-com:office:office" xmlns:oel="http://schemas.microsoft.com/office/2019/extlst" xmlns:r="http://schemas.openxmlformats.org/officeDocument/2006/relationships" xmlns:m="http://schemas.openxmlformats.org/officeDocument/2006/math" xmlns:v="urn:schemas-microsoft-com:vml" xmlns:wp14="http://schemas.microsoft.com/office/word/2010/wordprocessingDrawing" xmlns:wp="http://schemas.openxmlformats.org/drawingml/2006/wordprocessingDrawing" xmlns:w10="urn:schemas-microsoft-com:office:word" xmlns:w="http://schemas.openxmlformats.org/wordprocessingml/2006/main" xmlns:w14="http://schemas.microsoft.com/office/word/2010/wordml" xmlns:w15="http://schemas.microsoft.com/office/word/2012/wordml" xmlns:w16cex="http://schemas.microsoft.com/office/word/2018/wordml/cex" xmlns:w16cid="http://schemas.microsoft.com/office/word/2016/wordml/cid" xmlns:w16="http://schemas.microsoft.com/office/word/2018/wordml" xmlns:w16du="http://schemas.microsoft.com/office/word/2023/wordml/word16du" xmlns:w16sdtdh="http://schemas.microsoft.com/office/word/2020/wordml/sdtdatahash" xmlns:w16sdtfl="http://schemas.microsoft.com/office/word/2024/wordml/sdtformatlock" xmlns:w16se="http://schemas.microsoft.com/office/word/2015/wordml/symex" xmlns:wpg="http://schemas.microsoft.com/office/word/2010/wordprocessingGroup" xmlns:wpi="http://schemas.microsoft.com/office/word/2010/wordprocessingInk" xmlns:wne="http://schemas.microsoft.com/office/word/2006/wordml" xmlns:wps="http://schemas.microsoft.com/office/word/2010/wordprocessingShape" mc:Ignorable="w14 w15 w16se w16cid w16 w16cex w16sdtdh w16sdtfl w16du wp14">
   <w:p>
     <w:pPr>
-      <w:pStyle w:val="Footer"/>
-      <w:rPr/>
+      <w:pStyle w:val="Fuzeile"/>
     </w:pPr>
-    <w:r>
-      <w:rPr/>
-    </w:r>
   </w:p>
 </w:ftr>
 </file>
 
 <file path=word/footer2.xml><?xml version="1.0" encoding="utf-8"?>
-<w:ftr xmlns:o="urn:schemas-microsoft-com:office:office" xmlns:r="http://schemas.openxmlformats.org/officeDocument/2006/relationships" xmlns:v="urn:schemas-microsoft-com:vml" xmlns:w="http://schemas.openxmlformats.org/wordprocessingml/2006/main" xmlns:w10="urn:schemas-microsoft-com:office:word" xmlns:wp="http://schemas.openxmlformats.org/drawingml/2006/wordprocessingDrawing" xmlns:pic="http://schemas.openxmlformats.org/drawingml/2006/picture" xmlns:wps="http://schemas.microsoft.com/office/word/2010/wordprocessingShape" xmlns:wpg="http://schemas.microsoft.com/office/word/2010/wordprocessingGroup" xmlns:mc="http://schemas.openxmlformats.org/markup-compatibility/2006" xmlns:wp14="http://schemas.microsoft.com/office/word/2010/wordprocessingDrawing" xmlns:w14="http://schemas.microsoft.com/office/word/2010/wordml" xmlns:w15="http://schemas.microsoft.com/office/word/2012/wordml" mc:Ignorable="w14 wp14 w15">
+<w:ftr xmlns:wpc="http://schemas.microsoft.com/office/word/2010/wordprocessingCanvas" xmlns:cx="http://schemas.microsoft.com/office/drawing/2014/chartex" xmlns:cx1="http://schemas.microsoft.com/office/drawing/2015/9/8/chartex" xmlns:cx2="http://schemas.microsoft.com/office/drawing/2015/10/21/chartex" xmlns:cx3="http://schemas.microsoft.com/office/drawing/2016/5/9/chartex" xmlns:cx4="http://schemas.microsoft.com/office/drawing/2016/5/10/chartex" xmlns:cx5="http://schemas.microsoft.com/office/drawing/2016/5/11/chartex" xmlns:cx6="http://schemas.microsoft.com/office/drawing/2016/5/12/chartex" xmlns:cx7="http://schemas.microsoft.com/office/drawing/2016/5/13/chartex" xmlns:cx8="http://schemas.microsoft.com/office/drawing/2016/5/14/chartex" xmlns:mc="http://schemas.openxmlformats.org/markup-compatibility/2006" xmlns:aink="http://schemas.microsoft.com/office/drawing/2016/ink" xmlns:am3d="http://schemas.microsoft.com/office/drawing/2017/model3d" xmlns:o="urn:schemas-microsoft-com:office:office" xmlns:oel="http://schemas.microsoft.com/office/2019/extlst" xmlns:r="http://schemas.openxmlformats.org/officeDocument/2006/relationships" xmlns:m="http://schemas.openxmlformats.org/officeDocument/2006/math" xmlns:v="urn:schemas-microsoft-com:vml" xmlns:wp14="http://schemas.microsoft.com/office/word/2010/wordprocessingDrawing" xmlns:wp="http://schemas.openxmlformats.org/drawingml/2006/wordprocessingDrawing" xmlns:w10="urn:schemas-microsoft-com:office:word" xmlns:w="http://schemas.openxmlformats.org/wordprocessingml/2006/main" xmlns:w14="http://schemas.microsoft.com/office/word/2010/wordml" xmlns:w15="http://schemas.microsoft.com/office/word/2012/wordml" xmlns:w16cex="http://schemas.microsoft.com/office/word/2018/wordml/cex" xmlns:w16cid="http://schemas.microsoft.com/office/word/2016/wordml/cid" xmlns:w16="http://schemas.microsoft.com/office/word/2018/wordml" xmlns:w16du="http://schemas.microsoft.com/office/word/2023/wordml/word16du" xmlns:w16sdtdh="http://schemas.microsoft.com/office/word/2020/wordml/sdtdatahash" xmlns:w16sdtfl="http://schemas.microsoft.com/office/word/2024/wordml/sdtformatlock" xmlns:w16se="http://schemas.microsoft.com/office/word/2015/wordml/symex" xmlns:wpg="http://schemas.microsoft.com/office/word/2010/wordprocessingGroup" xmlns:wpi="http://schemas.microsoft.com/office/word/2010/wordprocessingInk" xmlns:wne="http://schemas.microsoft.com/office/word/2006/wordml" xmlns:wps="http://schemas.microsoft.com/office/word/2010/wordprocessingShape" mc:Ignorable="w14 w15 w16se w16cid w16 w16cex w16sdtdh w16sdtfl w16du wp14">
   <w:p>
     <w:pPr>
-      <w:pStyle w:val="Footer"/>
+      <w:pStyle w:val="Fuzeile"/>
       <w:rPr>
         <w:lang w:val="en-US"/>
       </w:rPr>
@@ -777,6 +773,7 @@
     </w:r>
     <w:r>
       <w:rPr>
+        <w:noProof/>
         <w:lang w:val="en-US"/>
       </w:rPr>
       <w:t>PETDiagClip_Testing.docx</w:t>
@@ -792,6 +789,11 @@
         <w:lang w:val="en-US"/>
       </w:rPr>
       <w:tab/>
+    </w:r>
+    <w:r>
+      <w:rPr>
+        <w:lang w:val="en-US"/>
+      </w:rPr>
       <w:tab/>
     </w:r>
     <w:r>
@@ -814,9 +816,10 @@
     </w:r>
     <w:r>
       <w:rPr>
-        <w:lang w:val="en-US"/>
-      </w:rPr>
-      <w:t>05.01.2026 23:12</w:t>
+        <w:noProof/>
+        <w:lang w:val="en-US"/>
+      </w:rPr>
+      <w:t>20.07.2026 20:01</w:t>
     </w:r>
     <w:r>
       <w:rPr>
@@ -827,7 +830,7 @@
   </w:p>
   <w:p>
     <w:pPr>
-      <w:pStyle w:val="Footer"/>
+      <w:pStyle w:val="Fuzeile"/>
       <w:rPr>
         <w:lang w:val="en-US"/>
       </w:rPr>
@@ -840,17 +843,13 @@
     </w:r>
     <w:sdt>
       <w:sdtPr>
-        <w:dataBinding w:prefixMappings="xmlns:ns0='http://purl.org/dc/elements/1.1/' xmlns:ns1='http://schemas.openxmlformats.org/package/2006/metadata/core-properties' " w:xpath="/ns1:coreProperties[1]/ns0:creator[1]" w:storeItemID="{6C3C8BC8-F283-45AE-878A-BAB7291924A1}"/>
         <w:alias w:val="Autor"/>
         <w:id w:val="1658342746"/>
+        <w:dataBinding w:prefixMappings="xmlns:ns0='http://purl.org/dc/elements/1.1/' xmlns:ns1='http://schemas.openxmlformats.org/package/2006/metadata/core-properties' " w:xpath="/ns1:coreProperties[1]/ns0:creator[1]" w:storeItemID="{6C3C8BC8-F283-45AE-878A-BAB7291924A1}"/>
         <w:text/>
       </w:sdtPr>
+      <w:sdtEndPr/>
       <w:sdtContent>
-        <w:r>
-          <w:rPr>
-            <w:lang w:val="en-US"/>
-          </w:rPr>
-        </w:r>
         <w:r>
           <w:rPr>
             <w:lang w:val="en-US"/>
@@ -864,114 +863,102 @@
         <w:lang w:val="en-US"/>
       </w:rPr>
       <w:tab/>
-    </w:r>
-    <w:r>
-      <w:rPr>
-        <w:lang w:val="en-US"/>
-      </w:rPr>
       <w:t xml:space="preserve">Page </w:t>
     </w:r>
     <w:r>
       <w:rPr>
-        <w:rStyle w:val="PageNumber"/>
+        <w:rStyle w:val="Seitenzahl"/>
         <w:lang w:val="en-US"/>
       </w:rPr>
       <w:fldChar w:fldCharType="begin"/>
     </w:r>
     <w:r>
       <w:rPr>
-        <w:rStyle w:val="PageNumber"/>
+        <w:rStyle w:val="Seitenzahl"/>
         <w:lang w:val="en-US"/>
       </w:rPr>
       <w:instrText xml:space="preserve"> PAGE </w:instrText>
     </w:r>
     <w:r>
       <w:rPr>
-        <w:rStyle w:val="PageNumber"/>
+        <w:rStyle w:val="Seitenzahl"/>
         <w:lang w:val="en-US"/>
       </w:rPr>
       <w:fldChar w:fldCharType="separate"/>
     </w:r>
     <w:r>
       <w:rPr>
-        <w:rStyle w:val="PageNumber"/>
+        <w:rStyle w:val="Seitenzahl"/>
         <w:lang w:val="en-US"/>
       </w:rPr>
       <w:t>1</w:t>
     </w:r>
     <w:r>
       <w:rPr>
-        <w:rStyle w:val="PageNumber"/>
+        <w:rStyle w:val="Seitenzahl"/>
         <w:lang w:val="en-US"/>
       </w:rPr>
       <w:fldChar w:fldCharType="end"/>
     </w:r>
     <w:r>
       <w:rPr>
-        <w:rStyle w:val="PageNumber"/>
+        <w:rStyle w:val="Seitenzahl"/>
         <w:lang w:val="en-US"/>
       </w:rPr>
       <w:t xml:space="preserve"> of </w:t>
     </w:r>
     <w:r>
       <w:rPr>
-        <w:rStyle w:val="PageNumber"/>
+        <w:rStyle w:val="Seitenzahl"/>
         <w:lang w:val="en-US"/>
       </w:rPr>
       <w:fldChar w:fldCharType="begin"/>
     </w:r>
     <w:r>
       <w:rPr>
-        <w:rStyle w:val="PageNumber"/>
+        <w:rStyle w:val="Seitenzahl"/>
         <w:lang w:val="en-US"/>
       </w:rPr>
       <w:instrText xml:space="preserve"> NUMPAGES </w:instrText>
     </w:r>
     <w:r>
       <w:rPr>
-        <w:rStyle w:val="PageNumber"/>
+        <w:rStyle w:val="Seitenzahl"/>
         <w:lang w:val="en-US"/>
       </w:rPr>
       <w:fldChar w:fldCharType="separate"/>
     </w:r>
     <w:r>
       <w:rPr>
-        <w:rStyle w:val="PageNumber"/>
+        <w:rStyle w:val="Seitenzahl"/>
         <w:lang w:val="en-US"/>
       </w:rPr>
       <w:t>2</w:t>
     </w:r>
     <w:r>
       <w:rPr>
-        <w:rStyle w:val="PageNumber"/>
+        <w:rStyle w:val="Seitenzahl"/>
         <w:lang w:val="en-US"/>
       </w:rPr>
       <w:fldChar w:fldCharType="end"/>
     </w:r>
     <w:r>
       <w:rPr>
-        <w:rStyle w:val="PageNumber"/>
+        <w:rStyle w:val="Seitenzahl"/>
         <w:lang w:val="en-US"/>
       </w:rPr>
       <w:tab/>
-      <w:t>Doc.-No.: 163-6-02-0</w:t>
-    </w:r>
-    <w:r>
-      <w:rPr>
-        <w:rStyle w:val="PageNumber"/>
-        <w:lang w:val="en-US"/>
-      </w:rPr>
-      <w:t>3</w:t>
+      <w:t>Doc.-No.: 163-6-02-03</w:t>
     </w:r>
   </w:p>
 </w:ftr>
 </file>
 
 <file path=word/footer3.xml><?xml version="1.0" encoding="utf-8"?>
-<w:ftr xmlns:o="urn:schemas-microsoft-com:office:office" xmlns:r="http://schemas.openxmlformats.org/officeDocument/2006/relationships" xmlns:v="urn:schemas-microsoft-com:vml" xmlns:w="http://schemas.openxmlformats.org/wordprocessingml/2006/main" xmlns:w10="urn:schemas-microsoft-com:office:word" xmlns:wp="http://schemas.openxmlformats.org/drawingml/2006/wordprocessingDrawing" xmlns:pic="http://schemas.openxmlformats.org/drawingml/2006/picture" xmlns:wps="http://schemas.microsoft.com/office/word/2010/wordprocessingShape" xmlns:wpg="http://schemas.microsoft.com/office/word/2010/wordprocessingGroup" xmlns:mc="http://schemas.openxmlformats.org/markup-compatibility/2006" xmlns:wp14="http://schemas.microsoft.com/office/word/2010/wordprocessingDrawing" xmlns:w14="http://schemas.microsoft.com/office/word/2010/wordml" xmlns:w15="http://schemas.microsoft.com/office/word/2012/wordml" mc:Ignorable="w14 wp14 w15">
+<w:ftr xmlns:wpc="http://schemas.microsoft.com/office/word/2010/wordprocessingCanvas" xmlns:cx="http://schemas.microsoft.com/office/drawing/2014/chartex" xmlns:cx1="http://schemas.microsoft.com/office/drawing/2015/9/8/chartex" xmlns:cx2="http://schemas.microsoft.com/office/drawing/2015/10/21/chartex" xmlns:cx3="http://schemas.microsoft.com/office/drawing/2016/5/9/chartex" xmlns:cx4="http://schemas.microsoft.com/office/drawing/2016/5/10/chartex" xmlns:cx5="http://schemas.microsoft.com/office/drawing/2016/5/11/chartex" xmlns:cx6="http://schemas.microsoft.com/office/drawing/2016/5/12/chartex" xmlns:cx7="http://schemas.microsoft.com/office/drawing/2016/5/13/chartex" xmlns:cx8="http://schemas.microsoft.com/office/drawing/2016/5/14/chartex" xmlns:mc="http://schemas.openxmlformats.org/markup-compatibility/2006" xmlns:aink="http://schemas.microsoft.com/office/drawing/2016/ink" xmlns:am3d="http://schemas.microsoft.com/office/drawing/2017/model3d" xmlns:o="urn:schemas-microsoft-com:office:office" xmlns:oel="http://schemas.microsoft.com/office/2019/extlst" xmlns:r="http://schemas.openxmlformats.org/officeDocument/2006/relationships" xmlns:m="http://schemas.openxmlformats.org/officeDocument/2006/math" xmlns:v="urn:schemas-microsoft-com:vml" xmlns:wp14="http://schemas.microsoft.com/office/word/2010/wordprocessingDrawing" xmlns:wp="http://schemas.openxmlformats.org/drawingml/2006/wordprocessingDrawing" xmlns:w10="urn:schemas-microsoft-com:office:word" xmlns:w="http://schemas.openxmlformats.org/wordprocessingml/2006/main" xmlns:w14="http://schemas.microsoft.com/office/word/2010/wordml" xmlns:w15="http://schemas.microsoft.com/office/word/2012/wordml" xmlns:w16cex="http://schemas.microsoft.com/office/word/2018/wordml/cex" xmlns:w16cid="http://schemas.microsoft.com/office/word/2016/wordml/cid" xmlns:w16="http://schemas.microsoft.com/office/word/2018/wordml" xmlns:w16du="http://schemas.microsoft.com/office/word/2023/wordml/word16du" xmlns:w16sdtdh="http://schemas.microsoft.com/office/word/2020/wordml/sdtdatahash" xmlns:w16sdtfl="http://schemas.microsoft.com/office/word/2024/wordml/sdtformatlock" xmlns:w16se="http://schemas.microsoft.com/office/word/2015/wordml/symex" xmlns:wpg="http://schemas.microsoft.com/office/word/2010/wordprocessingGroup" xmlns:wpi="http://schemas.microsoft.com/office/word/2010/wordprocessingInk" xmlns:wne="http://schemas.microsoft.com/office/word/2006/wordml" xmlns:wps="http://schemas.microsoft.com/office/word/2010/wordprocessingShape" mc:Ignorable="w14 w15 w16se w16cid w16 w16cex w16sdtdh w16sdtfl w16du wp14">
   <w:p>
     <w:pPr>
-      <w:pStyle w:val="Footer"/>
+      <w:pStyle w:val="Fuzeile"/>
       <w:rPr>
         <w:lang w:val="en-US"/>
       </w:rPr>
@@ -996,6 +983,7 @@
     </w:r>
     <w:r>
       <w:rPr>
+        <w:noProof/>
         <w:lang w:val="en-US"/>
       </w:rPr>
       <w:t>PETDiagClip_Testing.docx</w:t>
@@ -1011,6 +999,11 @@
         <w:lang w:val="en-US"/>
       </w:rPr>
       <w:tab/>
+    </w:r>
+    <w:r>
+      <w:rPr>
+        <w:lang w:val="en-US"/>
+      </w:rPr>
       <w:tab/>
     </w:r>
     <w:r>
@@ -1033,9 +1026,10 @@
     </w:r>
     <w:r>
       <w:rPr>
-        <w:lang w:val="en-US"/>
-      </w:rPr>
-      <w:t>05.01.2026 23:12</w:t>
+        <w:noProof/>
+        <w:lang w:val="en-US"/>
+      </w:rPr>
+      <w:t>20.07.2026 20:01</w:t>
     </w:r>
     <w:r>
       <w:rPr>
@@ -1046,7 +1040,7 @@
   </w:p>
   <w:p>
     <w:pPr>
-      <w:pStyle w:val="Footer"/>
+      <w:pStyle w:val="Fuzeile"/>
       <w:rPr>
         <w:lang w:val="en-US"/>
       </w:rPr>
@@ -1059,17 +1053,13 @@
     </w:r>
     <w:sdt>
       <w:sdtPr>
+        <w:alias w:val="Autor"/>
+        <w:id w:val="719094656"/>
         <w:dataBinding w:prefixMappings="xmlns:ns0='http://purl.org/dc/elements/1.1/' xmlns:ns1='http://schemas.openxmlformats.org/package/2006/metadata/core-properties' " w:xpath="/ns1:coreProperties[1]/ns0:creator[1]" w:storeItemID="{6C3C8BC8-F283-45AE-878A-BAB7291924A1}"/>
-        <w:alias w:val="Autor"/>
-        <w:id w:val="1658342746"/>
         <w:text/>
       </w:sdtPr>
+      <w:sdtEndPr/>
       <w:sdtContent>
-        <w:r>
-          <w:rPr>
-            <w:lang w:val="en-US"/>
-          </w:rPr>
-        </w:r>
         <w:r>
           <w:rPr>
             <w:lang w:val="en-US"/>
@@ -1083,122 +1073,138 @@
         <w:lang w:val="en-US"/>
       </w:rPr>
       <w:tab/>
-    </w:r>
-    <w:r>
-      <w:rPr>
-        <w:lang w:val="en-US"/>
-      </w:rPr>
       <w:t xml:space="preserve">Page </w:t>
     </w:r>
     <w:r>
       <w:rPr>
-        <w:rStyle w:val="PageNumber"/>
+        <w:rStyle w:val="Seitenzahl"/>
         <w:lang w:val="en-US"/>
       </w:rPr>
       <w:fldChar w:fldCharType="begin"/>
     </w:r>
     <w:r>
       <w:rPr>
-        <w:rStyle w:val="PageNumber"/>
+        <w:rStyle w:val="Seitenzahl"/>
         <w:lang w:val="en-US"/>
       </w:rPr>
       <w:instrText xml:space="preserve"> PAGE </w:instrText>
     </w:r>
     <w:r>
       <w:rPr>
-        <w:rStyle w:val="PageNumber"/>
+        <w:rStyle w:val="Seitenzahl"/>
         <w:lang w:val="en-US"/>
       </w:rPr>
       <w:fldChar w:fldCharType="separate"/>
     </w:r>
     <w:r>
       <w:rPr>
-        <w:rStyle w:val="PageNumber"/>
+        <w:rStyle w:val="Seitenzahl"/>
         <w:lang w:val="en-US"/>
       </w:rPr>
       <w:t>1</w:t>
     </w:r>
     <w:r>
       <w:rPr>
-        <w:rStyle w:val="PageNumber"/>
+        <w:rStyle w:val="Seitenzahl"/>
         <w:lang w:val="en-US"/>
       </w:rPr>
       <w:fldChar w:fldCharType="end"/>
     </w:r>
     <w:r>
       <w:rPr>
-        <w:rStyle w:val="PageNumber"/>
+        <w:rStyle w:val="Seitenzahl"/>
         <w:lang w:val="en-US"/>
       </w:rPr>
       <w:t xml:space="preserve"> of </w:t>
     </w:r>
     <w:r>
       <w:rPr>
-        <w:rStyle w:val="PageNumber"/>
+        <w:rStyle w:val="Seitenzahl"/>
         <w:lang w:val="en-US"/>
       </w:rPr>
       <w:fldChar w:fldCharType="begin"/>
     </w:r>
     <w:r>
       <w:rPr>
-        <w:rStyle w:val="PageNumber"/>
+        <w:rStyle w:val="Seitenzahl"/>
         <w:lang w:val="en-US"/>
       </w:rPr>
       <w:instrText xml:space="preserve"> NUMPAGES </w:instrText>
     </w:r>
     <w:r>
       <w:rPr>
-        <w:rStyle w:val="PageNumber"/>
+        <w:rStyle w:val="Seitenzahl"/>
         <w:lang w:val="en-US"/>
       </w:rPr>
       <w:fldChar w:fldCharType="separate"/>
     </w:r>
     <w:r>
       <w:rPr>
-        <w:rStyle w:val="PageNumber"/>
+        <w:rStyle w:val="Seitenzahl"/>
         <w:lang w:val="en-US"/>
       </w:rPr>
       <w:t>2</w:t>
     </w:r>
     <w:r>
       <w:rPr>
-        <w:rStyle w:val="PageNumber"/>
+        <w:rStyle w:val="Seitenzahl"/>
         <w:lang w:val="en-US"/>
       </w:rPr>
       <w:fldChar w:fldCharType="end"/>
     </w:r>
     <w:r>
       <w:rPr>
-        <w:rStyle w:val="PageNumber"/>
+        <w:rStyle w:val="Seitenzahl"/>
         <w:lang w:val="en-US"/>
       </w:rPr>
       <w:tab/>
-      <w:t>Doc.-No.: 163-6-02-0</w:t>
-    </w:r>
-    <w:r>
-      <w:rPr>
-        <w:rStyle w:val="PageNumber"/>
-        <w:lang w:val="en-US"/>
-      </w:rPr>
-      <w:t>3</w:t>
+      <w:t>Doc.-No.: 163-6-02-03</w:t>
     </w:r>
   </w:p>
 </w:ftr>
 </file>
 
+<file path=word/footnotes.xml><?xml version="1.0" encoding="utf-8"?>
+<w:footnotes xmlns:wpc="http://schemas.microsoft.com/office/word/2010/wordprocessingCanvas" xmlns:cx="http://schemas.microsoft.com/office/drawing/2014/chartex" xmlns:cx1="http://schemas.microsoft.com/office/drawing/2015/9/8/chartex" xmlns:cx2="http://schemas.microsoft.com/office/drawing/2015/10/21/chartex" xmlns:cx3="http://schemas.microsoft.com/office/drawing/2016/5/9/chartex" xmlns:cx4="http://schemas.microsoft.com/office/drawing/2016/5/10/chartex" xmlns:cx5="http://schemas.microsoft.com/office/drawing/2016/5/11/chartex" xmlns:cx6="http://schemas.microsoft.com/office/drawing/2016/5/12/chartex" xmlns:cx7="http://schemas.microsoft.com/office/drawing/2016/5/13/chartex" xmlns:cx8="http://schemas.microsoft.com/office/drawing/2016/5/14/chartex" xmlns:mc="http://schemas.openxmlformats.org/markup-compatibility/2006" xmlns:aink="http://schemas.microsoft.com/office/drawing/2016/ink" xmlns:am3d="http://schemas.microsoft.com/office/drawing/2017/model3d" xmlns:o="urn:schemas-microsoft-com:office:office" xmlns:oel="http://schemas.microsoft.com/office/2019/extlst" xmlns:r="http://schemas.openxmlformats.org/officeDocument/2006/relationships" xmlns:m="http://schemas.openxmlformats.org/officeDocument/2006/math" xmlns:v="urn:schemas-microsoft-com:vml" xmlns:wp14="http://schemas.microsoft.com/office/word/2010/wordprocessingDrawing" xmlns:wp="http://schemas.openxmlformats.org/drawingml/2006/wordprocessingDrawing" xmlns:w10="urn:schemas-microsoft-com:office:word" xmlns:w="http://schemas.openxmlformats.org/wordprocessingml/2006/main" xmlns:w14="http://schemas.microsoft.com/office/word/2010/wordml" xmlns:w15="http://schemas.microsoft.com/office/word/2012/wordml" xmlns:w16cex="http://schemas.microsoft.com/office/word/2018/wordml/cex" xmlns:w16cid="http://schemas.microsoft.com/office/word/2016/wordml/cid" xmlns:w16="http://schemas.microsoft.com/office/word/2018/wordml" xmlns:w16du="http://schemas.microsoft.com/office/word/2023/wordml/word16du" xmlns:w16sdtdh="http://schemas.microsoft.com/office/word/2020/wordml/sdtdatahash" xmlns:w16sdtfl="http://schemas.microsoft.com/office/word/2024/wordml/sdtformatlock" xmlns:w16se="http://schemas.microsoft.com/office/word/2015/wordml/symex" xmlns:wpg="http://schemas.microsoft.com/office/word/2010/wordprocessingGroup" xmlns:wpi="http://schemas.microsoft.com/office/word/2010/wordprocessingInk" xmlns:wne="http://schemas.microsoft.com/office/word/2006/wordml" xmlns:wps="http://schemas.microsoft.com/office/word/2010/wordprocessingShape" mc:Ignorable="w14 w15 w16se w16cid w16 w16cex w16sdtdh w16sdtfl w16du wp14">
+  <w:footnote w:type="separator" w:id="-1">
+    <w:p>
+      <w:pPr>
+        <w:spacing w:after="0" w:line="240" w:lineRule="auto"/>
+      </w:pPr>
+      <w:r>
+        <w:separator/>
+      </w:r>
+    </w:p>
+  </w:footnote>
+  <w:footnote w:type="continuationSeparator" w:id="0">
+    <w:p>
+      <w:pPr>
+        <w:spacing w:after="0" w:line="240" w:lineRule="auto"/>
+      </w:pPr>
+      <w:r>
+        <w:continuationSeparator/>
+      </w:r>
+    </w:p>
+  </w:footnote>
+</w:footnotes>
+</file>
+
 <file path=word/numbering.xml><?xml version="1.0" encoding="utf-8"?>
-<w:numbering xmlns:w="http://schemas.openxmlformats.org/wordprocessingml/2006/main" xmlns:o="urn:schemas-microsoft-com:office:office" xmlns:r="http://schemas.openxmlformats.org/officeDocument/2006/relationships" xmlns:v="urn:schemas-microsoft-com:vml" xmlns:mc="http://schemas.openxmlformats.org/markup-compatibility/2006" xmlns:w14="http://schemas.microsoft.com/office/word/2010/wordml" mc:Ignorable="w14">
-  <w:abstractNum w:abstractNumId="1">
+<w:numbering xmlns:wpc="http://schemas.microsoft.com/office/word/2010/wordprocessingCanvas" xmlns:cx="http://schemas.microsoft.com/office/drawing/2014/chartex" xmlns:cx1="http://schemas.microsoft.com/office/drawing/2015/9/8/chartex" xmlns:cx2="http://schemas.microsoft.com/office/drawing/2015/10/21/chartex" xmlns:cx3="http://schemas.microsoft.com/office/drawing/2016/5/9/chartex" xmlns:cx4="http://schemas.microsoft.com/office/drawing/2016/5/10/chartex" xmlns:cx5="http://schemas.microsoft.com/office/drawing/2016/5/11/chartex" xmlns:cx6="http://schemas.microsoft.com/office/drawing/2016/5/12/chartex" xmlns:cx7="http://schemas.microsoft.com/office/drawing/2016/5/13/chartex" xmlns:cx8="http://schemas.microsoft.com/office/drawing/2016/5/14/chartex" xmlns:mc="http://schemas.openxmlformats.org/markup-compatibility/2006" xmlns:aink="http://schemas.microsoft.com/office/drawing/2016/ink" xmlns:am3d="http://schemas.microsoft.com/office/drawing/2017/model3d" xmlns:o="urn:schemas-microsoft-com:office:office" xmlns:oel="http://schemas.microsoft.com/office/2019/extlst" xmlns:r="http://schemas.openxmlformats.org/officeDocument/2006/relationships" xmlns:m="http://schemas.openxmlformats.org/officeDocument/2006/math" xmlns:v="urn:schemas-microsoft-com:vml" xmlns:wp14="http://schemas.microsoft.com/office/word/2010/wordprocessingDrawing" xmlns:wp="http://schemas.openxmlformats.org/drawingml/2006/wordprocessingDrawing" xmlns:w10="urn:schemas-microsoft-com:office:word" xmlns:w="http://schemas.openxmlformats.org/wordprocessingml/2006/main" xmlns:w14="http://schemas.microsoft.com/office/word/2010/wordml" xmlns:w15="http://schemas.microsoft.com/office/word/2012/wordml" xmlns:w16cex="http://schemas.microsoft.com/office/word/2018/wordml/cex" xmlns:w16cid="http://schemas.microsoft.com/office/word/2016/wordml/cid" xmlns:w16="http://schemas.microsoft.com/office/word/2018/wordml" xmlns:w16du="http://schemas.microsoft.com/office/word/2023/wordml/word16du" xmlns:w16sdtdh="http://schemas.microsoft.com/office/word/2020/wordml/sdtdatahash" xmlns:w16sdtfl="http://schemas.microsoft.com/office/word/2024/wordml/sdtformatlock" xmlns:w16se="http://schemas.microsoft.com/office/word/2015/wordml/symex" xmlns:wpg="http://schemas.microsoft.com/office/word/2010/wordprocessingGroup" xmlns:wpi="http://schemas.microsoft.com/office/word/2010/wordprocessingInk" xmlns:wne="http://schemas.microsoft.com/office/word/2006/wordml" xmlns:wps="http://schemas.microsoft.com/office/word/2010/wordprocessingShape" mc:Ignorable="w14 w15 w16se w16cid w16 w16cex w16sdtdh w16sdtfl w16du wp14">
+  <w:abstractNum w:abstractNumId="0" w15:restartNumberingAfterBreak="0">
+    <w:nsid w:val="139D0F08"/>
+    <w:multiLevelType w:val="multilevel"/>
+    <w:tmpl w:val="D742B9A4"/>
     <w:lvl w:ilvl="0">
       <w:start w:val="1"/>
       <w:numFmt w:val="bullet"/>
       <w:lvlText w:val=""/>
-      <w:lvlJc w:val="start"/>
+      <w:lvlJc w:val="left"/>
       <w:pPr>
         <w:tabs>
           <w:tab w:val="num" w:pos="0"/>
         </w:tabs>
-        <w:ind w:start="720" w:hanging="360"/>
+        <w:ind w:left="720" w:hanging="360"/>
       </w:pPr>
       <w:rPr>
         <w:rFonts w:ascii="Symbol" w:hAnsi="Symbol" w:cs="Symbol" w:hint="default"/>
@@ -1208,12 +1214,12 @@
       <w:start w:val="1"/>
       <w:numFmt w:val="bullet"/>
       <w:lvlText w:val="o"/>
-      <w:lvlJc w:val="start"/>
+      <w:lvlJc w:val="left"/>
       <w:pPr>
         <w:tabs>
           <w:tab w:val="num" w:pos="0"/>
         </w:tabs>
-        <w:ind w:start="1440" w:hanging="360"/>
+        <w:ind w:left="1440" w:hanging="360"/>
       </w:pPr>
       <w:rPr>
         <w:rFonts w:ascii="Courier New" w:hAnsi="Courier New" w:cs="Courier New" w:hint="default"/>
@@ -1223,12 +1229,12 @@
       <w:start w:val="1"/>
       <w:numFmt w:val="bullet"/>
       <w:lvlText w:val=""/>
-      <w:lvlJc w:val="start"/>
+      <w:lvlJc w:val="left"/>
       <w:pPr>
         <w:tabs>
           <w:tab w:val="num" w:pos="0"/>
         </w:tabs>
-        <w:ind w:start="2160" w:hanging="360"/>
+        <w:ind w:left="2160" w:hanging="360"/>
       </w:pPr>
       <w:rPr>
         <w:rFonts w:ascii="Wingdings" w:hAnsi="Wingdings" w:cs="Wingdings" w:hint="default"/>
@@ -1238,12 +1244,12 @@
       <w:start w:val="1"/>
       <w:numFmt w:val="bullet"/>
       <w:lvlText w:val=""/>
-      <w:lvlJc w:val="start"/>
+      <w:lvlJc w:val="left"/>
       <w:pPr>
         <w:tabs>
           <w:tab w:val="num" w:pos="0"/>
         </w:tabs>
-        <w:ind w:start="2880" w:hanging="360"/>
+        <w:ind w:left="2880" w:hanging="360"/>
       </w:pPr>
       <w:rPr>
         <w:rFonts w:ascii="Symbol" w:hAnsi="Symbol" w:cs="Symbol" w:hint="default"/>
@@ -1253,12 +1259,12 @@
       <w:start w:val="1"/>
       <w:numFmt w:val="bullet"/>
       <w:lvlText w:val="o"/>
-      <w:lvlJc w:val="start"/>
+      <w:lvlJc w:val="left"/>
       <w:pPr>
         <w:tabs>
           <w:tab w:val="num" w:pos="0"/>
         </w:tabs>
-        <w:ind w:start="3600" w:hanging="360"/>
+        <w:ind w:left="3600" w:hanging="360"/>
       </w:pPr>
       <w:rPr>
         <w:rFonts w:ascii="Courier New" w:hAnsi="Courier New" w:cs="Courier New" w:hint="default"/>
@@ -1268,12 +1274,12 @@
       <w:start w:val="1"/>
       <w:numFmt w:val="bullet"/>
       <w:lvlText w:val=""/>
-      <w:lvlJc w:val="start"/>
+      <w:lvlJc w:val="left"/>
       <w:pPr>
         <w:tabs>
           <w:tab w:val="num" w:pos="0"/>
         </w:tabs>
-        <w:ind w:start="4320" w:hanging="360"/>
+        <w:ind w:left="4320" w:hanging="360"/>
       </w:pPr>
       <w:rPr>
         <w:rFonts w:ascii="Wingdings" w:hAnsi="Wingdings" w:cs="Wingdings" w:hint="default"/>
@@ -1283,12 +1289,12 @@
       <w:start w:val="1"/>
       <w:numFmt w:val="bullet"/>
       <w:lvlText w:val=""/>
-      <w:lvlJc w:val="start"/>
+      <w:lvlJc w:val="left"/>
       <w:pPr>
         <w:tabs>
           <w:tab w:val="num" w:pos="0"/>
         </w:tabs>
-        <w:ind w:start="5040" w:hanging="360"/>
+        <w:ind w:left="5040" w:hanging="360"/>
       </w:pPr>
       <w:rPr>
         <w:rFonts w:ascii="Symbol" w:hAnsi="Symbol" w:cs="Symbol" w:hint="default"/>
@@ -1298,12 +1304,12 @@
       <w:start w:val="1"/>
       <w:numFmt w:val="bullet"/>
       <w:lvlText w:val="o"/>
-      <w:lvlJc w:val="start"/>
+      <w:lvlJc w:val="left"/>
       <w:pPr>
         <w:tabs>
           <w:tab w:val="num" w:pos="0"/>
         </w:tabs>
-        <w:ind w:start="5760" w:hanging="360"/>
+        <w:ind w:left="5760" w:hanging="360"/>
       </w:pPr>
       <w:rPr>
         <w:rFonts w:ascii="Courier New" w:hAnsi="Courier New" w:cs="Courier New" w:hint="default"/>
@@ -1313,29 +1319,32 @@
       <w:start w:val="1"/>
       <w:numFmt w:val="bullet"/>
       <w:lvlText w:val=""/>
-      <w:lvlJc w:val="start"/>
+      <w:lvlJc w:val="left"/>
       <w:pPr>
         <w:tabs>
           <w:tab w:val="num" w:pos="0"/>
         </w:tabs>
-        <w:ind w:start="6480" w:hanging="360"/>
+        <w:ind w:left="6480" w:hanging="360"/>
       </w:pPr>
       <w:rPr>
         <w:rFonts w:ascii="Wingdings" w:hAnsi="Wingdings" w:cs="Wingdings" w:hint="default"/>
       </w:rPr>
     </w:lvl>
   </w:abstractNum>
-  <w:abstractNum w:abstractNumId="2">
+  <w:abstractNum w:abstractNumId="1" w15:restartNumberingAfterBreak="0">
+    <w:nsid w:val="5CE7424B"/>
+    <w:multiLevelType w:val="multilevel"/>
+    <w:tmpl w:val="DF3CBCE6"/>
     <w:lvl w:ilvl="0">
       <w:start w:val="1"/>
       <w:numFmt w:val="bullet"/>
       <w:lvlText w:val=""/>
-      <w:lvlJc w:val="start"/>
+      <w:lvlJc w:val="left"/>
       <w:pPr>
         <w:tabs>
           <w:tab w:val="num" w:pos="0"/>
         </w:tabs>
-        <w:ind w:start="720" w:hanging="360"/>
+        <w:ind w:left="720" w:hanging="360"/>
       </w:pPr>
       <w:rPr>
         <w:rFonts w:ascii="Symbol" w:hAnsi="Symbol" w:cs="Symbol" w:hint="default"/>
@@ -1345,12 +1354,12 @@
       <w:start w:val="1"/>
       <w:numFmt w:val="bullet"/>
       <w:lvlText w:val="o"/>
-      <w:lvlJc w:val="start"/>
+      <w:lvlJc w:val="left"/>
       <w:pPr>
         <w:tabs>
           <w:tab w:val="num" w:pos="0"/>
         </w:tabs>
-        <w:ind w:start="1440" w:hanging="360"/>
+        <w:ind w:left="1440" w:hanging="360"/>
       </w:pPr>
       <w:rPr>
         <w:rFonts w:ascii="Courier New" w:hAnsi="Courier New" w:cs="Courier New" w:hint="default"/>
@@ -1360,12 +1369,12 @@
       <w:start w:val="1"/>
       <w:numFmt w:val="bullet"/>
       <w:lvlText w:val=""/>
-      <w:lvlJc w:val="start"/>
+      <w:lvlJc w:val="left"/>
       <w:pPr>
         <w:tabs>
           <w:tab w:val="num" w:pos="0"/>
         </w:tabs>
-        <w:ind w:start="2160" w:hanging="360"/>
+        <w:ind w:left="2160" w:hanging="360"/>
       </w:pPr>
       <w:rPr>
         <w:rFonts w:ascii="Wingdings" w:hAnsi="Wingdings" w:cs="Wingdings" w:hint="default"/>
@@ -1375,12 +1384,12 @@
       <w:start w:val="1"/>
       <w:numFmt w:val="bullet"/>
       <w:lvlText w:val=""/>
-      <w:lvlJc w:val="start"/>
+      <w:lvlJc w:val="left"/>
       <w:pPr>
         <w:tabs>
           <w:tab w:val="num" w:pos="0"/>
         </w:tabs>
-        <w:ind w:start="2880" w:hanging="360"/>
+        <w:ind w:left="2880" w:hanging="360"/>
       </w:pPr>
       <w:rPr>
         <w:rFonts w:ascii="Symbol" w:hAnsi="Symbol" w:cs="Symbol" w:hint="default"/>
@@ -1390,12 +1399,12 @@
       <w:start w:val="1"/>
       <w:numFmt w:val="bullet"/>
       <w:lvlText w:val="o"/>
-      <w:lvlJc w:val="start"/>
+      <w:lvlJc w:val="left"/>
       <w:pPr>
         <w:tabs>
           <w:tab w:val="num" w:pos="0"/>
         </w:tabs>
-        <w:ind w:start="3600" w:hanging="360"/>
+        <w:ind w:left="3600" w:hanging="360"/>
       </w:pPr>
       <w:rPr>
         <w:rFonts w:ascii="Courier New" w:hAnsi="Courier New" w:cs="Courier New" w:hint="default"/>
@@ -1405,12 +1414,12 @@
       <w:start w:val="1"/>
       <w:numFmt w:val="bullet"/>
       <w:lvlText w:val=""/>
-      <w:lvlJc w:val="start"/>
+      <w:lvlJc w:val="left"/>
       <w:pPr>
         <w:tabs>
           <w:tab w:val="num" w:pos="0"/>
         </w:tabs>
-        <w:ind w:start="4320" w:hanging="360"/>
+        <w:ind w:left="4320" w:hanging="360"/>
       </w:pPr>
       <w:rPr>
         <w:rFonts w:ascii="Wingdings" w:hAnsi="Wingdings" w:cs="Wingdings" w:hint="default"/>
@@ -1420,12 +1429,12 @@
       <w:start w:val="1"/>
       <w:numFmt w:val="bullet"/>
       <w:lvlText w:val=""/>
-      <w:lvlJc w:val="start"/>
+      <w:lvlJc w:val="left"/>
       <w:pPr>
         <w:tabs>
           <w:tab w:val="num" w:pos="0"/>
         </w:tabs>
-        <w:ind w:start="5040" w:hanging="360"/>
+        <w:ind w:left="5040" w:hanging="360"/>
       </w:pPr>
       <w:rPr>
         <w:rFonts w:ascii="Symbol" w:hAnsi="Symbol" w:cs="Symbol" w:hint="default"/>
@@ -1435,12 +1444,12 @@
       <w:start w:val="1"/>
       <w:numFmt w:val="bullet"/>
       <w:lvlText w:val="o"/>
-      <w:lvlJc w:val="start"/>
+      <w:lvlJc w:val="left"/>
       <w:pPr>
         <w:tabs>
           <w:tab w:val="num" w:pos="0"/>
         </w:tabs>
-        <w:ind w:start="5760" w:hanging="360"/>
+        <w:ind w:left="5760" w:hanging="360"/>
       </w:pPr>
       <w:rPr>
         <w:rFonts w:ascii="Courier New" w:hAnsi="Courier New" w:cs="Courier New" w:hint="default"/>
@@ -1450,30 +1459,33 @@
       <w:start w:val="1"/>
       <w:numFmt w:val="bullet"/>
       <w:lvlText w:val=""/>
-      <w:lvlJc w:val="start"/>
+      <w:lvlJc w:val="left"/>
       <w:pPr>
         <w:tabs>
           <w:tab w:val="num" w:pos="0"/>
         </w:tabs>
-        <w:ind w:start="6480" w:hanging="360"/>
+        <w:ind w:left="6480" w:hanging="360"/>
       </w:pPr>
       <w:rPr>
         <w:rFonts w:ascii="Wingdings" w:hAnsi="Wingdings" w:cs="Wingdings" w:hint="default"/>
       </w:rPr>
     </w:lvl>
   </w:abstractNum>
-  <w:abstractNum w:abstractNumId="3">
+  <w:abstractNum w:abstractNumId="2" w15:restartNumberingAfterBreak="0">
+    <w:nsid w:val="7BBC3748"/>
+    <w:multiLevelType w:val="multilevel"/>
+    <w:tmpl w:val="287A4142"/>
     <w:lvl w:ilvl="0">
       <w:start w:val="1"/>
       <w:numFmt w:val="none"/>
       <w:suff w:val="nothing"/>
       <w:lvlText w:val=""/>
-      <w:lvlJc w:val="start"/>
+      <w:lvlJc w:val="left"/>
       <w:pPr>
         <w:tabs>
           <w:tab w:val="num" w:pos="0"/>
         </w:tabs>
-        <w:ind w:start="0" w:hanging="0"/>
+        <w:ind w:left="0" w:firstLine="0"/>
       </w:pPr>
     </w:lvl>
     <w:lvl w:ilvl="1">
@@ -1481,12 +1493,12 @@
       <w:numFmt w:val="none"/>
       <w:suff w:val="nothing"/>
       <w:lvlText w:val=""/>
-      <w:lvlJc w:val="start"/>
+      <w:lvlJc w:val="left"/>
       <w:pPr>
         <w:tabs>
           <w:tab w:val="num" w:pos="0"/>
         </w:tabs>
-        <w:ind w:start="0" w:hanging="0"/>
+        <w:ind w:left="0" w:firstLine="0"/>
       </w:pPr>
     </w:lvl>
     <w:lvl w:ilvl="2">
@@ -1494,12 +1506,12 @@
       <w:numFmt w:val="none"/>
       <w:suff w:val="nothing"/>
       <w:lvlText w:val=""/>
-      <w:lvlJc w:val="start"/>
+      <w:lvlJc w:val="left"/>
       <w:pPr>
         <w:tabs>
           <w:tab w:val="num" w:pos="0"/>
         </w:tabs>
-        <w:ind w:start="0" w:hanging="0"/>
+        <w:ind w:left="0" w:firstLine="0"/>
       </w:pPr>
     </w:lvl>
     <w:lvl w:ilvl="3">
@@ -1507,12 +1519,12 @@
       <w:numFmt w:val="none"/>
       <w:suff w:val="nothing"/>
       <w:lvlText w:val=""/>
-      <w:lvlJc w:val="start"/>
+      <w:lvlJc w:val="left"/>
       <w:pPr>
         <w:tabs>
           <w:tab w:val="num" w:pos="0"/>
         </w:tabs>
-        <w:ind w:start="0" w:hanging="0"/>
+        <w:ind w:left="0" w:firstLine="0"/>
       </w:pPr>
     </w:lvl>
     <w:lvl w:ilvl="4">
@@ -1520,12 +1532,12 @@
       <w:numFmt w:val="none"/>
       <w:suff w:val="nothing"/>
       <w:lvlText w:val=""/>
-      <w:lvlJc w:val="start"/>
+      <w:lvlJc w:val="left"/>
       <w:pPr>
         <w:tabs>
           <w:tab w:val="num" w:pos="0"/>
         </w:tabs>
-        <w:ind w:start="0" w:hanging="0"/>
+        <w:ind w:left="0" w:firstLine="0"/>
       </w:pPr>
     </w:lvl>
     <w:lvl w:ilvl="5">
@@ -1533,12 +1545,12 @@
       <w:numFmt w:val="none"/>
       <w:suff w:val="nothing"/>
       <w:lvlText w:val=""/>
-      <w:lvlJc w:val="start"/>
+      <w:lvlJc w:val="left"/>
       <w:pPr>
         <w:tabs>
           <w:tab w:val="num" w:pos="0"/>
         </w:tabs>
-        <w:ind w:start="0" w:hanging="0"/>
+        <w:ind w:left="0" w:firstLine="0"/>
       </w:pPr>
     </w:lvl>
     <w:lvl w:ilvl="6">
@@ -1546,12 +1558,12 @@
       <w:numFmt w:val="none"/>
       <w:suff w:val="nothing"/>
       <w:lvlText w:val=""/>
-      <w:lvlJc w:val="start"/>
+      <w:lvlJc w:val="left"/>
       <w:pPr>
         <w:tabs>
           <w:tab w:val="num" w:pos="0"/>
         </w:tabs>
-        <w:ind w:start="0" w:hanging="0"/>
+        <w:ind w:left="0" w:firstLine="0"/>
       </w:pPr>
     </w:lvl>
     <w:lvl w:ilvl="7">
@@ -1559,12 +1571,12 @@
       <w:numFmt w:val="none"/>
       <w:suff w:val="nothing"/>
       <w:lvlText w:val=""/>
-      <w:lvlJc w:val="start"/>
+      <w:lvlJc w:val="left"/>
       <w:pPr>
         <w:tabs>
           <w:tab w:val="num" w:pos="0"/>
         </w:tabs>
-        <w:ind w:start="0" w:hanging="0"/>
+        <w:ind w:left="0" w:firstLine="0"/>
       </w:pPr>
     </w:lvl>
     <w:lvl w:ilvl="8">
@@ -1572,33 +1584,33 @@
       <w:numFmt w:val="none"/>
       <w:suff w:val="nothing"/>
       <w:lvlText w:val=""/>
-      <w:lvlJc w:val="start"/>
+      <w:lvlJc w:val="left"/>
       <w:pPr>
         <w:tabs>
           <w:tab w:val="num" w:pos="0"/>
         </w:tabs>
-        <w:ind w:start="0" w:hanging="0"/>
+        <w:ind w:left="0" w:firstLine="0"/>
       </w:pPr>
     </w:lvl>
   </w:abstractNum>
-  <w:num w:numId="1">
+  <w:num w:numId="1" w16cid:durableId="549924576">
     <w:abstractNumId w:val="1"/>
   </w:num>
-  <w:num w:numId="2">
+  <w:num w:numId="2" w16cid:durableId="1012293360">
+    <w:abstractNumId w:val="0"/>
+  </w:num>
+  <w:num w:numId="3" w16cid:durableId="1766611210">
     <w:abstractNumId w:val="2"/>
-  </w:num>
-  <w:num w:numId="3">
-    <w:abstractNumId w:val="3"/>
   </w:num>
 </w:numbering>
 </file>
 
 <file path=word/styles.xml><?xml version="1.0" encoding="utf-8"?>
-<w:styles xmlns:w="http://schemas.openxmlformats.org/wordprocessingml/2006/main" xmlns:w14="http://schemas.microsoft.com/office/word/2010/wordml" xmlns:mc="http://schemas.openxmlformats.org/markup-compatibility/2006" mc:Ignorable="w14">
+<w:styles xmlns:mc="http://schemas.openxmlformats.org/markup-compatibility/2006" xmlns:r="http://schemas.openxmlformats.org/officeDocument/2006/relationships" xmlns:w="http://schemas.openxmlformats.org/wordprocessingml/2006/main" xmlns:w14="http://schemas.microsoft.com/office/word/2010/wordml" xmlns:w15="http://schemas.microsoft.com/office/word/2012/wordml" xmlns:w16cex="http://schemas.microsoft.com/office/word/2018/wordml/cex" xmlns:w16cid="http://schemas.microsoft.com/office/word/2016/wordml/cid" xmlns:w16="http://schemas.microsoft.com/office/word/2018/wordml" xmlns:w16du="http://schemas.microsoft.com/office/word/2023/wordml/word16du" xmlns:w16sdtdh="http://schemas.microsoft.com/office/word/2020/wordml/sdtdatahash" xmlns:w16sdtfl="http://schemas.microsoft.com/office/word/2024/wordml/sdtformatlock" xmlns:w16se="http://schemas.microsoft.com/office/word/2015/wordml/symex" mc:Ignorable="w14 w15 w16se w16cid w16 w16cex w16sdtdh w16sdtfl w16du">
   <w:docDefaults>
     <w:rPrDefault>
       <w:rPr>
-        <w:rFonts w:ascii="Calibri" w:hAnsi="Calibri" w:eastAsia="Calibri" w:cs="Cordia New" w:asciiTheme="minorHAnsi" w:cstheme="minorBidi" w:eastAsiaTheme="minorHAnsi" w:hAnsiTheme="minorHAnsi"/>
+        <w:rFonts w:asciiTheme="minorHAnsi" w:eastAsiaTheme="minorHAnsi" w:hAnsiTheme="minorHAnsi" w:cstheme="minorBidi"/>
         <w:sz w:val="22"/>
         <w:szCs w:val="28"/>
         <w:lang w:val="de-DE" w:eastAsia="en-US" w:bidi="th-TH"/>
@@ -1606,21 +1618,21 @@
     </w:rPrDefault>
     <w:pPrDefault>
       <w:pPr>
-        <w:suppressAutoHyphens w:val="true"/>
+        <w:suppressAutoHyphens/>
       </w:pPr>
     </w:pPrDefault>
   </w:docDefaults>
   <w:latentStyles w:defLockedState="0" w:defUIPriority="99" w:defSemiHidden="0" w:defUnhideWhenUsed="0" w:defQFormat="0" w:count="376">
     <w:lsdException w:name="Normal" w:uiPriority="0" w:qFormat="1"/>
     <w:lsdException w:name="heading 1" w:uiPriority="9" w:qFormat="1"/>
-    <w:lsdException w:name="heading 2" w:uiPriority="9" w:semiHidden="1" w:unhideWhenUsed="1" w:qFormat="1"/>
-    <w:lsdException w:name="heading 3" w:uiPriority="9" w:semiHidden="1" w:unhideWhenUsed="1" w:qFormat="1"/>
-    <w:lsdException w:name="heading 4" w:uiPriority="9" w:semiHidden="1" w:unhideWhenUsed="1" w:qFormat="1"/>
-    <w:lsdException w:name="heading 5" w:uiPriority="9" w:semiHidden="1" w:unhideWhenUsed="1" w:qFormat="1"/>
-    <w:lsdException w:name="heading 6" w:uiPriority="9" w:semiHidden="1" w:unhideWhenUsed="1" w:qFormat="1"/>
-    <w:lsdException w:name="heading 7" w:uiPriority="9" w:semiHidden="1" w:unhideWhenUsed="1" w:qFormat="1"/>
-    <w:lsdException w:name="heading 8" w:uiPriority="9" w:semiHidden="1" w:unhideWhenUsed="1" w:qFormat="1"/>
-    <w:lsdException w:name="heading 9" w:uiPriority="9" w:semiHidden="1" w:unhideWhenUsed="1" w:qFormat="1"/>
+    <w:lsdException w:name="heading 2" w:semiHidden="1" w:uiPriority="9" w:unhideWhenUsed="1" w:qFormat="1"/>
+    <w:lsdException w:name="heading 3" w:semiHidden="1" w:uiPriority="9" w:unhideWhenUsed="1" w:qFormat="1"/>
+    <w:lsdException w:name="heading 4" w:semiHidden="1" w:uiPriority="9" w:unhideWhenUsed="1" w:qFormat="1"/>
+    <w:lsdException w:name="heading 5" w:semiHidden="1" w:uiPriority="9" w:unhideWhenUsed="1" w:qFormat="1"/>
+    <w:lsdException w:name="heading 6" w:semiHidden="1" w:uiPriority="9" w:unhideWhenUsed="1" w:qFormat="1"/>
+    <w:lsdException w:name="heading 7" w:semiHidden="1" w:uiPriority="9" w:unhideWhenUsed="1" w:qFormat="1"/>
+    <w:lsdException w:name="heading 8" w:semiHidden="1" w:uiPriority="9" w:unhideWhenUsed="1" w:qFormat="1"/>
+    <w:lsdException w:name="heading 9" w:semiHidden="1" w:uiPriority="9" w:unhideWhenUsed="1" w:qFormat="1"/>
     <w:lsdException w:name="index 1" w:semiHidden="1" w:unhideWhenUsed="1"/>
     <w:lsdException w:name="index 2" w:semiHidden="1" w:unhideWhenUsed="1"/>
     <w:lsdException w:name="index 3" w:semiHidden="1" w:unhideWhenUsed="1"/>
@@ -1630,29 +1642,29 @@
     <w:lsdException w:name="index 7" w:semiHidden="1" w:unhideWhenUsed="1"/>
     <w:lsdException w:name="index 8" w:semiHidden="1" w:unhideWhenUsed="1"/>
     <w:lsdException w:name="index 9" w:semiHidden="1" w:unhideWhenUsed="1"/>
-    <w:lsdException w:name="toc 1" w:uiPriority="39" w:semiHidden="1" w:unhideWhenUsed="1"/>
-    <w:lsdException w:name="toc 2" w:uiPriority="39" w:semiHidden="1" w:unhideWhenUsed="1"/>
-    <w:lsdException w:name="toc 3" w:uiPriority="39" w:semiHidden="1" w:unhideWhenUsed="1"/>
-    <w:lsdException w:name="toc 4" w:uiPriority="39" w:semiHidden="1" w:unhideWhenUsed="1"/>
-    <w:lsdException w:name="toc 5" w:uiPriority="39" w:semiHidden="1" w:unhideWhenUsed="1"/>
-    <w:lsdException w:name="toc 6" w:uiPriority="39" w:semiHidden="1" w:unhideWhenUsed="1"/>
-    <w:lsdException w:name="toc 7" w:uiPriority="39" w:semiHidden="1" w:unhideWhenUsed="1"/>
-    <w:lsdException w:name="toc 8" w:uiPriority="39" w:semiHidden="1" w:unhideWhenUsed="1"/>
-    <w:lsdException w:name="toc 9" w:uiPriority="39" w:semiHidden="1" w:unhideWhenUsed="1"/>
+    <w:lsdException w:name="toc 1" w:semiHidden="1" w:uiPriority="39" w:unhideWhenUsed="1"/>
+    <w:lsdException w:name="toc 2" w:semiHidden="1" w:uiPriority="39" w:unhideWhenUsed="1"/>
+    <w:lsdException w:name="toc 3" w:semiHidden="1" w:uiPriority="39" w:unhideWhenUsed="1"/>
+    <w:lsdException w:name="toc 4" w:semiHidden="1" w:uiPriority="39" w:unhideWhenUsed="1"/>
+    <w:lsdException w:name="toc 5" w:semiHidden="1" w:uiPriority="39" w:unhideWhenUsed="1"/>
+    <w:lsdException w:name="toc 6" w:semiHidden="1" w:uiPriority="39" w:unhideWhenUsed="1"/>
+    <w:lsdException w:name="toc 7" w:semiHidden="1" w:uiPriority="39" w:unhideWhenUsed="1"/>
+    <w:lsdException w:name="toc 8" w:semiHidden="1" w:uiPriority="39" w:unhideWhenUsed="1"/>
+    <w:lsdException w:name="toc 9" w:semiHidden="1" w:uiPriority="39" w:unhideWhenUsed="1"/>
     <w:lsdException w:name="Normal Indent" w:semiHidden="1" w:unhideWhenUsed="1"/>
     <w:lsdException w:name="footnote text" w:semiHidden="1" w:unhideWhenUsed="1"/>
     <w:lsdException w:name="annotation text" w:semiHidden="1" w:unhideWhenUsed="1"/>
     <w:lsdException w:name="header" w:semiHidden="1" w:unhideWhenUsed="1"/>
     <w:lsdException w:name="footer" w:semiHidden="1" w:unhideWhenUsed="1"/>
     <w:lsdException w:name="index heading" w:semiHidden="1" w:unhideWhenUsed="1"/>
-    <w:lsdException w:name="caption" w:uiPriority="35" w:semiHidden="1" w:unhideWhenUsed="1" w:qFormat="1"/>
+    <w:lsdException w:name="caption" w:semiHidden="1" w:uiPriority="35" w:unhideWhenUsed="1" w:qFormat="1"/>
     <w:lsdException w:name="table of figures" w:semiHidden="1" w:unhideWhenUsed="1"/>
     <w:lsdException w:name="envelope address" w:semiHidden="1" w:unhideWhenUsed="1"/>
     <w:lsdException w:name="envelope return" w:semiHidden="1" w:unhideWhenUsed="1"/>
     <w:lsdException w:name="footnote reference" w:semiHidden="1" w:unhideWhenUsed="1"/>
     <w:lsdException w:name="annotation reference" w:semiHidden="1" w:unhideWhenUsed="1"/>
     <w:lsdException w:name="line number" w:semiHidden="1" w:unhideWhenUsed="1"/>
-    <w:lsdException w:name="page number" w:uiPriority="0" w:semiHidden="1" w:unhideWhenUsed="1"/>
+    <w:lsdException w:name="page number" w:semiHidden="1" w:uiPriority="0" w:unhideWhenUsed="1"/>
     <w:lsdException w:name="endnote reference" w:semiHidden="1" w:unhideWhenUsed="1"/>
     <w:lsdException w:name="endnote text" w:semiHidden="1" w:unhideWhenUsed="1"/>
     <w:lsdException w:name="table of authorities" w:semiHidden="1" w:unhideWhenUsed="1"/>
@@ -1676,7 +1688,7 @@
     <w:lsdException w:name="Title" w:uiPriority="10" w:qFormat="1"/>
     <w:lsdException w:name="Closing" w:semiHidden="1" w:unhideWhenUsed="1"/>
     <w:lsdException w:name="Signature" w:semiHidden="1" w:unhideWhenUsed="1"/>
-    <w:lsdException w:name="Default Paragraph Font" w:uiPriority="1" w:semiHidden="1" w:unhideWhenUsed="1"/>
+    <w:lsdException w:name="Default Paragraph Font" w:semiHidden="1" w:uiPriority="1" w:unhideWhenUsed="1"/>
     <w:lsdException w:name="Body Text" w:semiHidden="1" w:unhideWhenUsed="1"/>
     <w:lsdException w:name="Body Text Indent" w:semiHidden="1" w:unhideWhenUsed="1"/>
     <w:lsdException w:name="List Continue" w:semiHidden="1" w:unhideWhenUsed="1"/>
@@ -1876,8 +1888,8 @@
     <w:lsdException w:name="Subtle Reference" w:uiPriority="31" w:qFormat="1"/>
     <w:lsdException w:name="Intense Reference" w:uiPriority="32" w:qFormat="1"/>
     <w:lsdException w:name="Book Title" w:uiPriority="33" w:qFormat="1"/>
-    <w:lsdException w:name="Bibliography" w:uiPriority="37" w:semiHidden="1" w:unhideWhenUsed="1"/>
-    <w:lsdException w:name="TOC Heading" w:uiPriority="39" w:semiHidden="1" w:unhideWhenUsed="1" w:qFormat="1"/>
+    <w:lsdException w:name="Bibliography" w:semiHidden="1" w:uiPriority="37" w:unhideWhenUsed="1"/>
+    <w:lsdException w:name="TOC Heading" w:semiHidden="1" w:uiPriority="39" w:unhideWhenUsed="1" w:qFormat="1"/>
     <w:lsdException w:name="Plain Table 1" w:uiPriority="41"/>
     <w:lsdException w:name="Plain Table 2" w:uiPriority="42"/>
     <w:lsdException w:name="Plain Table 3" w:uiPriority="43"/>
@@ -1988,412 +2000,430 @@
     <w:lsdException w:name="Unresolved Mention" w:semiHidden="1" w:unhideWhenUsed="1"/>
     <w:lsdException w:name="Smart Link" w:semiHidden="1" w:unhideWhenUsed="1"/>
   </w:latentStyles>
-  <w:style w:type="paragraph" w:styleId="Normal" w:default="1">
+  <w:style w:type="paragraph" w:default="1" w:styleId="Standard">
     <w:name w:val="Normal"/>
     <w:qFormat/>
-    <w:rsid w:val="00a92bb9"/>
+    <w:rsid w:val="00A92BB9"/>
     <w:pPr>
-      <w:widowControl/>
-      <w:bidi w:val="0"/>
-      <w:spacing w:lineRule="auto" w:line="259" w:before="0" w:after="160"/>
-      <w:jc w:val="start"/>
+      <w:spacing w:after="160" w:line="259" w:lineRule="auto"/>
     </w:pPr>
     <w:rPr>
-      <w:rFonts w:ascii="Futura Lt BT" w:hAnsi="Futura Lt BT" w:eastAsia="Calibri" w:cs="Cordia New" w:cstheme="minorBidi" w:eastAsiaTheme="minorHAnsi"/>
-      <w:color w:val="auto"/>
-      <w:kern w:val="0"/>
-      <w:sz w:val="22"/>
-      <w:szCs w:val="28"/>
-      <w:lang w:val="de-DE" w:eastAsia="en-US" w:bidi="th-TH"/>
-    </w:rPr>
-  </w:style>
-  <w:style w:type="paragraph" w:styleId="Heading1">
+      <w:rFonts w:ascii="Futura Lt BT" w:hAnsi="Futura Lt BT"/>
+    </w:rPr>
+  </w:style>
+  <w:style w:type="paragraph" w:styleId="berschrift1">
     <w:name w:val="heading 1"/>
-    <w:basedOn w:val="Normal"/>
-    <w:next w:val="Normal"/>
+    <w:basedOn w:val="Standard"/>
+    <w:next w:val="Standard"/>
     <w:link w:val="berschrift1Zchn"/>
     <w:uiPriority w:val="9"/>
     <w:qFormat/>
-    <w:rsid w:val="00ce5d11"/>
+    <w:rsid w:val="00CE5D11"/>
     <w:pPr>
-      <w:keepNext w:val="true"/>
+      <w:keepNext/>
       <w:keepLines/>
       <w:spacing w:before="240" w:after="0"/>
       <w:outlineLvl w:val="0"/>
     </w:pPr>
     <w:rPr>
-      <w:rFonts w:eastAsia="" w:cs="Angsana New" w:cstheme="majorBidi" w:eastAsiaTheme="majorEastAsia"/>
-      <w:color w:themeColor="text1" w:val="000000"/>
+      <w:rFonts w:eastAsiaTheme="majorEastAsia" w:cstheme="majorBidi"/>
+      <w:color w:val="000000" w:themeColor="text1"/>
       <w:sz w:val="32"/>
       <w:szCs w:val="40"/>
     </w:rPr>
   </w:style>
-  <w:style w:type="paragraph" w:styleId="Heading2">
+  <w:style w:type="paragraph" w:styleId="berschrift2">
     <w:name w:val="heading 2"/>
-    <w:basedOn w:val="Normal"/>
-    <w:next w:val="Normal"/>
+    <w:basedOn w:val="Standard"/>
+    <w:next w:val="Standard"/>
     <w:link w:val="berschrift2Zchn"/>
     <w:uiPriority w:val="9"/>
     <w:unhideWhenUsed/>
     <w:qFormat/>
-    <w:rsid w:val="00a92bb9"/>
+    <w:rsid w:val="00A92BB9"/>
     <w:pPr>
-      <w:keepNext w:val="true"/>
+      <w:keepNext/>
       <w:keepLines/>
       <w:spacing w:before="40" w:after="0"/>
       <w:outlineLvl w:val="1"/>
     </w:pPr>
     <w:rPr>
-      <w:rFonts w:eastAsia="" w:cs="Angsana New" w:cstheme="majorBidi" w:eastAsiaTheme="majorEastAsia"/>
-      <w:color w:themeColor="accent1" w:themeShade="bf" w:val="2F5496"/>
+      <w:rFonts w:eastAsiaTheme="majorEastAsia" w:cstheme="majorBidi"/>
+      <w:color w:val="2F5496" w:themeColor="accent1" w:themeShade="BF"/>
       <w:sz w:val="26"/>
       <w:szCs w:val="33"/>
     </w:rPr>
   </w:style>
-  <w:style w:type="paragraph" w:styleId="Heading3">
+  <w:style w:type="paragraph" w:styleId="berschrift3">
     <w:name w:val="heading 3"/>
-    <w:basedOn w:val="Normal"/>
-    <w:next w:val="Normal"/>
+    <w:basedOn w:val="Standard"/>
+    <w:next w:val="Standard"/>
     <w:link w:val="berschrift3Zchn"/>
     <w:uiPriority w:val="9"/>
     <w:unhideWhenUsed/>
     <w:qFormat/>
-    <w:rsid w:val="00a92bb9"/>
+    <w:rsid w:val="00A92BB9"/>
     <w:pPr>
-      <w:keepNext w:val="true"/>
+      <w:keepNext/>
       <w:keepLines/>
       <w:spacing w:before="40" w:after="0"/>
       <w:outlineLvl w:val="2"/>
     </w:pPr>
     <w:rPr>
-      <w:rFonts w:eastAsia="" w:cs="Angsana New" w:cstheme="majorBidi" w:eastAsiaTheme="majorEastAsia"/>
-      <w:color w:themeColor="accent1" w:themeShade="7f" w:val="1F3763"/>
+      <w:rFonts w:eastAsiaTheme="majorEastAsia" w:cstheme="majorBidi"/>
+      <w:color w:val="1F3763" w:themeColor="accent1" w:themeShade="7F"/>
       <w:sz w:val="24"/>
       <w:szCs w:val="30"/>
     </w:rPr>
   </w:style>
-  <w:style w:type="paragraph" w:styleId="Heading4">
+  <w:style w:type="paragraph" w:styleId="berschrift4">
     <w:name w:val="heading 4"/>
-    <w:basedOn w:val="Normal"/>
-    <w:next w:val="Normal"/>
+    <w:basedOn w:val="Standard"/>
+    <w:next w:val="Standard"/>
     <w:link w:val="berschrift4Zchn"/>
     <w:uiPriority w:val="9"/>
     <w:unhideWhenUsed/>
     <w:qFormat/>
-    <w:rsid w:val="00a92bb9"/>
+    <w:rsid w:val="00A92BB9"/>
     <w:pPr>
-      <w:keepNext w:val="true"/>
+      <w:keepNext/>
       <w:keepLines/>
       <w:spacing w:before="40" w:after="0"/>
       <w:outlineLvl w:val="3"/>
     </w:pPr>
     <w:rPr>
-      <w:rFonts w:eastAsia="" w:cs="Angsana New" w:cstheme="majorBidi" w:eastAsiaTheme="majorEastAsia"/>
+      <w:rFonts w:eastAsiaTheme="majorEastAsia" w:cstheme="majorBidi"/>
       <w:i/>
       <w:iCs/>
-      <w:color w:themeColor="accent1" w:themeShade="bf" w:val="2F5496"/>
-    </w:rPr>
-  </w:style>
-  <w:style w:type="paragraph" w:styleId="Heading5">
+      <w:color w:val="2F5496" w:themeColor="accent1" w:themeShade="BF"/>
+    </w:rPr>
+  </w:style>
+  <w:style w:type="paragraph" w:styleId="berschrift5">
     <w:name w:val="heading 5"/>
-    <w:basedOn w:val="Normal"/>
-    <w:next w:val="Normal"/>
+    <w:basedOn w:val="Standard"/>
+    <w:next w:val="Standard"/>
     <w:link w:val="berschrift5Zchn"/>
     <w:uiPriority w:val="9"/>
     <w:unhideWhenUsed/>
     <w:qFormat/>
-    <w:rsid w:val="00a92bb9"/>
+    <w:rsid w:val="00A92BB9"/>
     <w:pPr>
-      <w:keepNext w:val="true"/>
+      <w:keepNext/>
       <w:keepLines/>
       <w:spacing w:before="40" w:after="0"/>
       <w:outlineLvl w:val="4"/>
     </w:pPr>
     <w:rPr>
-      <w:rFonts w:eastAsia="" w:cs="Angsana New" w:cstheme="majorBidi" w:eastAsiaTheme="majorEastAsia"/>
-      <w:color w:themeColor="accent1" w:themeShade="bf" w:val="2F5496"/>
-    </w:rPr>
-  </w:style>
-  <w:style w:type="paragraph" w:styleId="Heading6">
+      <w:rFonts w:eastAsiaTheme="majorEastAsia" w:cstheme="majorBidi"/>
+      <w:color w:val="2F5496" w:themeColor="accent1" w:themeShade="BF"/>
+    </w:rPr>
+  </w:style>
+  <w:style w:type="paragraph" w:styleId="berschrift6">
     <w:name w:val="heading 6"/>
-    <w:basedOn w:val="Normal"/>
-    <w:next w:val="Normal"/>
+    <w:basedOn w:val="Standard"/>
+    <w:next w:val="Standard"/>
     <w:link w:val="berschrift6Zchn"/>
     <w:uiPriority w:val="9"/>
     <w:unhideWhenUsed/>
     <w:qFormat/>
-    <w:rsid w:val="00a92bb9"/>
+    <w:rsid w:val="00A92BB9"/>
     <w:pPr>
-      <w:keepNext w:val="true"/>
+      <w:keepNext/>
       <w:keepLines/>
       <w:spacing w:before="40" w:after="0"/>
       <w:outlineLvl w:val="5"/>
     </w:pPr>
     <w:rPr>
-      <w:rFonts w:eastAsia="" w:cs="Angsana New" w:cstheme="majorBidi" w:eastAsiaTheme="majorEastAsia"/>
-      <w:color w:themeColor="accent1" w:themeShade="7f" w:val="1F3763"/>
-    </w:rPr>
-  </w:style>
-  <w:style w:type="character" w:styleId="DefaultParagraphFont" w:default="1">
+      <w:rFonts w:eastAsiaTheme="majorEastAsia" w:cstheme="majorBidi"/>
+      <w:color w:val="1F3763" w:themeColor="accent1" w:themeShade="7F"/>
+    </w:rPr>
+  </w:style>
+  <w:style w:type="character" w:default="1" w:styleId="Absatz-Standardschriftart">
     <w:name w:val="Default Paragraph Font"/>
     <w:uiPriority w:val="1"/>
     <w:semiHidden/>
     <w:unhideWhenUsed/>
-    <w:qFormat/>
-    <w:rPr/>
-  </w:style>
-  <w:style w:type="character" w:styleId="KopfzeileZchn" w:customStyle="1">
-    <w:name w:val="Kopfzeile Zchn"/>
-    <w:basedOn w:val="DefaultParagraphFont"/>
-    <w:uiPriority w:val="99"/>
-    <w:qFormat/>
-    <w:rsid w:val="004207bd"/>
-    <w:rPr/>
-  </w:style>
-  <w:style w:type="character" w:styleId="FuzeileZchn" w:customStyle="1">
-    <w:name w:val="Fußzeile Zchn"/>
-    <w:basedOn w:val="DefaultParagraphFont"/>
-    <w:uiPriority w:val="99"/>
-    <w:qFormat/>
-    <w:rsid w:val="004207bd"/>
-    <w:rPr/>
-  </w:style>
-  <w:style w:type="character" w:styleId="PlaceholderText">
-    <w:name w:val="Placeholder Text"/>
-    <w:basedOn w:val="DefaultParagraphFont"/>
+  </w:style>
+  <w:style w:type="table" w:default="1" w:styleId="NormaleTabelle">
+    <w:name w:val="Normal Table"/>
     <w:uiPriority w:val="99"/>
     <w:semiHidden/>
-    <w:qFormat/>
-    <w:rsid w:val="004207bd"/>
-    <w:rPr>
-      <w:color w:val="808080"/>
-    </w:rPr>
-  </w:style>
-  <w:style w:type="character" w:styleId="PageNumber">
-    <w:name w:val="page number"/>
-    <w:basedOn w:val="DefaultParagraphFont"/>
-    <w:rsid w:val="007c0ebe"/>
-    <w:rPr/>
-  </w:style>
-  <w:style w:type="character" w:styleId="SprechblasentextZchn" w:customStyle="1">
-    <w:name w:val="Sprechblasentext Zchn"/>
-    <w:basedOn w:val="DefaultParagraphFont"/>
-    <w:link w:val="BalloonText"/>
+    <w:unhideWhenUsed/>
+    <w:tblPr>
+      <w:tblInd w:w="0" w:type="dxa"/>
+      <w:tblCellMar>
+        <w:top w:w="0" w:type="dxa"/>
+        <w:left w:w="108" w:type="dxa"/>
+        <w:bottom w:w="0" w:type="dxa"/>
+        <w:right w:w="108" w:type="dxa"/>
+      </w:tblCellMar>
+    </w:tblPr>
+  </w:style>
+  <w:style w:type="numbering" w:default="1" w:styleId="KeineListe">
+    <w:name w:val="No List"/>
     <w:uiPriority w:val="99"/>
     <w:semiHidden/>
-    <w:qFormat/>
-    <w:rsid w:val="00ee5a9e"/>
+    <w:unhideWhenUsed/>
+  </w:style>
+  <w:style w:type="character" w:customStyle="1" w:styleId="KopfzeileZchn">
+    <w:name w:val="Kopfzeile Zchn"/>
+    <w:basedOn w:val="Absatz-Standardschriftart"/>
+    <w:link w:val="Kopfzeile"/>
+    <w:uiPriority w:val="99"/>
+    <w:qFormat/>
+    <w:rsid w:val="004207BD"/>
+  </w:style>
+  <w:style w:type="character" w:customStyle="1" w:styleId="FuzeileZchn">
+    <w:name w:val="Fußzeile Zchn"/>
+    <w:basedOn w:val="Absatz-Standardschriftart"/>
+    <w:link w:val="Fuzeile"/>
+    <w:uiPriority w:val="99"/>
+    <w:qFormat/>
+    <w:rsid w:val="004207BD"/>
+  </w:style>
+  <w:style w:type="character" w:styleId="Platzhaltertext">
+    <w:name w:val="Placeholder Text"/>
+    <w:basedOn w:val="Absatz-Standardschriftart"/>
+    <w:uiPriority w:val="99"/>
+    <w:semiHidden/>
+    <w:qFormat/>
+    <w:rsid w:val="004207BD"/>
+    <w:rPr>
+      <w:color w:val="808080"/>
+    </w:rPr>
+  </w:style>
+  <w:style w:type="character" w:styleId="Seitenzahl">
+    <w:name w:val="page number"/>
+    <w:basedOn w:val="Absatz-Standardschriftart"/>
+    <w:rsid w:val="007C0EBE"/>
+  </w:style>
+  <w:style w:type="character" w:customStyle="1" w:styleId="SprechblasentextZchn">
+    <w:name w:val="Sprechblasentext Zchn"/>
+    <w:basedOn w:val="Absatz-Standardschriftart"/>
+    <w:link w:val="Sprechblasentext"/>
+    <w:uiPriority w:val="99"/>
+    <w:semiHidden/>
+    <w:qFormat/>
+    <w:rsid w:val="00EE5A9E"/>
     <w:rPr>
       <w:rFonts w:ascii="Segoe UI" w:hAnsi="Segoe UI" w:cs="Angsana New"/>
       <w:sz w:val="18"/>
       <w:szCs w:val="22"/>
     </w:rPr>
   </w:style>
-  <w:style w:type="character" w:styleId="berschrift1Zchn" w:customStyle="1">
+  <w:style w:type="character" w:customStyle="1" w:styleId="berschrift1Zchn">
     <w:name w:val="Überschrift 1 Zchn"/>
-    <w:basedOn w:val="DefaultParagraphFont"/>
+    <w:basedOn w:val="Absatz-Standardschriftart"/>
+    <w:link w:val="berschrift1"/>
     <w:uiPriority w:val="9"/>
     <w:qFormat/>
-    <w:rsid w:val="00ce5d11"/>
-    <w:rPr>
-      <w:rFonts w:ascii="Futura Lt BT" w:hAnsi="Futura Lt BT" w:eastAsia="" w:cs="Angsana New" w:cstheme="majorBidi" w:eastAsiaTheme="majorEastAsia"/>
-      <w:color w:themeColor="text1" w:val="000000"/>
+    <w:rsid w:val="00CE5D11"/>
+    <w:rPr>
+      <w:rFonts w:ascii="Futura Lt BT" w:eastAsiaTheme="majorEastAsia" w:hAnsi="Futura Lt BT" w:cstheme="majorBidi"/>
+      <w:color w:val="000000" w:themeColor="text1"/>
       <w:sz w:val="32"/>
       <w:szCs w:val="40"/>
     </w:rPr>
   </w:style>
-  <w:style w:type="character" w:styleId="berschrift2Zchn" w:customStyle="1">
+  <w:style w:type="character" w:customStyle="1" w:styleId="berschrift2Zchn">
     <w:name w:val="Überschrift 2 Zchn"/>
-    <w:basedOn w:val="DefaultParagraphFont"/>
+    <w:basedOn w:val="Absatz-Standardschriftart"/>
+    <w:link w:val="berschrift2"/>
     <w:uiPriority w:val="9"/>
     <w:qFormat/>
-    <w:rsid w:val="00a92bb9"/>
-    <w:rPr>
-      <w:rFonts w:ascii="Futura Lt BT" w:hAnsi="Futura Lt BT" w:eastAsia="" w:cs="Angsana New" w:cstheme="majorBidi" w:eastAsiaTheme="majorEastAsia"/>
-      <w:color w:themeColor="accent1" w:themeShade="bf" w:val="2F5496"/>
+    <w:rsid w:val="00A92BB9"/>
+    <w:rPr>
+      <w:rFonts w:ascii="Futura Lt BT" w:eastAsiaTheme="majorEastAsia" w:hAnsi="Futura Lt BT" w:cstheme="majorBidi"/>
+      <w:color w:val="2F5496" w:themeColor="accent1" w:themeShade="BF"/>
       <w:sz w:val="26"/>
       <w:szCs w:val="33"/>
     </w:rPr>
   </w:style>
-  <w:style w:type="character" w:styleId="berschrift3Zchn" w:customStyle="1">
+  <w:style w:type="character" w:customStyle="1" w:styleId="berschrift3Zchn">
     <w:name w:val="Überschrift 3 Zchn"/>
-    <w:basedOn w:val="DefaultParagraphFont"/>
+    <w:basedOn w:val="Absatz-Standardschriftart"/>
+    <w:link w:val="berschrift3"/>
     <w:uiPriority w:val="9"/>
     <w:qFormat/>
-    <w:rsid w:val="00a92bb9"/>
-    <w:rPr>
-      <w:rFonts w:ascii="Futura Lt BT" w:hAnsi="Futura Lt BT" w:eastAsia="" w:cs="Angsana New" w:cstheme="majorBidi" w:eastAsiaTheme="majorEastAsia"/>
-      <w:color w:themeColor="accent1" w:themeShade="7f" w:val="1F3763"/>
+    <w:rsid w:val="00A92BB9"/>
+    <w:rPr>
+      <w:rFonts w:ascii="Futura Lt BT" w:eastAsiaTheme="majorEastAsia" w:hAnsi="Futura Lt BT" w:cstheme="majorBidi"/>
+      <w:color w:val="1F3763" w:themeColor="accent1" w:themeShade="7F"/>
       <w:sz w:val="24"/>
       <w:szCs w:val="30"/>
     </w:rPr>
   </w:style>
-  <w:style w:type="character" w:styleId="berschrift4Zchn" w:customStyle="1">
+  <w:style w:type="character" w:customStyle="1" w:styleId="berschrift4Zchn">
     <w:name w:val="Überschrift 4 Zchn"/>
-    <w:basedOn w:val="DefaultParagraphFont"/>
+    <w:basedOn w:val="Absatz-Standardschriftart"/>
+    <w:link w:val="berschrift4"/>
     <w:uiPriority w:val="9"/>
     <w:qFormat/>
-    <w:rsid w:val="00a92bb9"/>
-    <w:rPr>
-      <w:rFonts w:ascii="Futura Lt BT" w:hAnsi="Futura Lt BT" w:eastAsia="" w:cs="Angsana New" w:cstheme="majorBidi" w:eastAsiaTheme="majorEastAsia"/>
+    <w:rsid w:val="00A92BB9"/>
+    <w:rPr>
+      <w:rFonts w:ascii="Futura Lt BT" w:eastAsiaTheme="majorEastAsia" w:hAnsi="Futura Lt BT" w:cstheme="majorBidi"/>
       <w:i/>
       <w:iCs/>
-      <w:color w:themeColor="accent1" w:themeShade="bf" w:val="2F5496"/>
-    </w:rPr>
-  </w:style>
-  <w:style w:type="character" w:styleId="berschrift5Zchn" w:customStyle="1">
+      <w:color w:val="2F5496" w:themeColor="accent1" w:themeShade="BF"/>
+    </w:rPr>
+  </w:style>
+  <w:style w:type="character" w:customStyle="1" w:styleId="berschrift5Zchn">
     <w:name w:val="Überschrift 5 Zchn"/>
-    <w:basedOn w:val="DefaultParagraphFont"/>
+    <w:basedOn w:val="Absatz-Standardschriftart"/>
+    <w:link w:val="berschrift5"/>
     <w:uiPriority w:val="9"/>
     <w:qFormat/>
-    <w:rsid w:val="00a92bb9"/>
-    <w:rPr>
-      <w:rFonts w:ascii="Futura Lt BT" w:hAnsi="Futura Lt BT" w:eastAsia="" w:cs="Angsana New" w:cstheme="majorBidi" w:eastAsiaTheme="majorEastAsia"/>
-      <w:color w:themeColor="accent1" w:themeShade="bf" w:val="2F5496"/>
-    </w:rPr>
-  </w:style>
-  <w:style w:type="character" w:styleId="berschrift6Zchn" w:customStyle="1">
+    <w:rsid w:val="00A92BB9"/>
+    <w:rPr>
+      <w:rFonts w:ascii="Futura Lt BT" w:eastAsiaTheme="majorEastAsia" w:hAnsi="Futura Lt BT" w:cstheme="majorBidi"/>
+      <w:color w:val="2F5496" w:themeColor="accent1" w:themeShade="BF"/>
+    </w:rPr>
+  </w:style>
+  <w:style w:type="character" w:customStyle="1" w:styleId="berschrift6Zchn">
     <w:name w:val="Überschrift 6 Zchn"/>
-    <w:basedOn w:val="DefaultParagraphFont"/>
+    <w:basedOn w:val="Absatz-Standardschriftart"/>
+    <w:link w:val="berschrift6"/>
     <w:uiPriority w:val="9"/>
     <w:qFormat/>
-    <w:rsid w:val="00a92bb9"/>
-    <w:rPr>
-      <w:rFonts w:ascii="Futura Lt BT" w:hAnsi="Futura Lt BT" w:eastAsia="" w:cs="Angsana New" w:cstheme="majorBidi" w:eastAsiaTheme="majorEastAsia"/>
-      <w:color w:themeColor="accent1" w:themeShade="7f" w:val="1F3763"/>
-    </w:rPr>
-  </w:style>
-  <w:style w:type="character" w:styleId="TitelZchn" w:customStyle="1">
+    <w:rsid w:val="00A92BB9"/>
+    <w:rPr>
+      <w:rFonts w:ascii="Futura Lt BT" w:eastAsiaTheme="majorEastAsia" w:hAnsi="Futura Lt BT" w:cstheme="majorBidi"/>
+      <w:color w:val="1F3763" w:themeColor="accent1" w:themeShade="7F"/>
+    </w:rPr>
+  </w:style>
+  <w:style w:type="character" w:customStyle="1" w:styleId="TitelZchn">
     <w:name w:val="Titel Zchn"/>
-    <w:basedOn w:val="DefaultParagraphFont"/>
+    <w:basedOn w:val="Absatz-Standardschriftart"/>
+    <w:link w:val="Titel"/>
     <w:uiPriority w:val="10"/>
     <w:qFormat/>
-    <w:rsid w:val="00a92bb9"/>
-    <w:rPr>
-      <w:rFonts w:ascii="Futura Lt BT" w:hAnsi="Futura Lt BT" w:eastAsia="" w:cs="Angsana New" w:cstheme="majorBidi" w:eastAsiaTheme="majorEastAsia"/>
+    <w:rsid w:val="00A92BB9"/>
+    <w:rPr>
+      <w:rFonts w:ascii="Futura Lt BT" w:eastAsiaTheme="majorEastAsia" w:hAnsi="Futura Lt BT" w:cstheme="majorBidi"/>
       <w:spacing w:val="-10"/>
       <w:kern w:val="2"/>
       <w:sz w:val="56"/>
       <w:szCs w:val="71"/>
     </w:rPr>
   </w:style>
-  <w:style w:type="character" w:styleId="UntertitelZchn" w:customStyle="1">
+  <w:style w:type="character" w:customStyle="1" w:styleId="UntertitelZchn">
     <w:name w:val="Untertitel Zchn"/>
-    <w:basedOn w:val="DefaultParagraphFont"/>
+    <w:basedOn w:val="Absatz-Standardschriftart"/>
+    <w:link w:val="Untertitel"/>
     <w:uiPriority w:val="11"/>
     <w:qFormat/>
-    <w:rsid w:val="00a92bb9"/>
-    <w:rPr>
-      <w:rFonts w:ascii="Futura Lt BT" w:hAnsi="Futura Lt BT" w:eastAsia="" w:eastAsiaTheme="minorEastAsia"/>
-      <w:color w:themeColor="text1" w:themeTint="a5" w:val="5A5A5A"/>
+    <w:rsid w:val="00A92BB9"/>
+    <w:rPr>
+      <w:rFonts w:ascii="Futura Lt BT" w:eastAsiaTheme="minorEastAsia" w:hAnsi="Futura Lt BT"/>
+      <w:color w:val="5A5A5A" w:themeColor="text1" w:themeTint="A5"/>
       <w:spacing w:val="15"/>
     </w:rPr>
   </w:style>
-  <w:style w:type="character" w:styleId="SubtleEmphasis">
+  <w:style w:type="character" w:styleId="SchwacheHervorhebung">
     <w:name w:val="Subtle Emphasis"/>
-    <w:basedOn w:val="DefaultParagraphFont"/>
+    <w:basedOn w:val="Absatz-Standardschriftart"/>
     <w:uiPriority w:val="19"/>
     <w:qFormat/>
-    <w:rsid w:val="00a92bb9"/>
+    <w:rsid w:val="00A92BB9"/>
     <w:rPr>
       <w:i/>
       <w:iCs/>
-      <w:color w:themeColor="text1" w:themeTint="bf" w:val="404040"/>
-    </w:rPr>
-  </w:style>
-  <w:style w:type="character" w:styleId="Emphasis">
+      <w:color w:val="404040" w:themeColor="text1" w:themeTint="BF"/>
+    </w:rPr>
+  </w:style>
+  <w:style w:type="character" w:styleId="Hervorhebung">
     <w:name w:val="Emphasis"/>
-    <w:basedOn w:val="DefaultParagraphFont"/>
+    <w:basedOn w:val="Absatz-Standardschriftart"/>
     <w:uiPriority w:val="20"/>
     <w:qFormat/>
-    <w:rsid w:val="00a92bb9"/>
+    <w:rsid w:val="00A92BB9"/>
     <w:rPr>
       <w:i/>
       <w:iCs/>
     </w:rPr>
   </w:style>
-  <w:style w:type="character" w:styleId="IntenseEmphasis">
+  <w:style w:type="character" w:styleId="IntensiveHervorhebung">
     <w:name w:val="Intense Emphasis"/>
-    <w:basedOn w:val="DefaultParagraphFont"/>
+    <w:basedOn w:val="Absatz-Standardschriftart"/>
     <w:uiPriority w:val="21"/>
     <w:qFormat/>
-    <w:rsid w:val="00a92bb9"/>
+    <w:rsid w:val="00A92BB9"/>
     <w:rPr>
       <w:i/>
       <w:iCs/>
-      <w:color w:themeColor="accent1" w:val="4472C4"/>
-    </w:rPr>
-  </w:style>
-  <w:style w:type="character" w:styleId="Strong">
+      <w:color w:val="4472C4" w:themeColor="accent1"/>
+    </w:rPr>
+  </w:style>
+  <w:style w:type="character" w:styleId="Fett">
     <w:name w:val="Strong"/>
-    <w:basedOn w:val="DefaultParagraphFont"/>
+    <w:basedOn w:val="Absatz-Standardschriftart"/>
     <w:uiPriority w:val="22"/>
     <w:qFormat/>
-    <w:rsid w:val="00a92bb9"/>
+    <w:rsid w:val="00A92BB9"/>
     <w:rPr>
       <w:b/>
       <w:bCs/>
     </w:rPr>
   </w:style>
-  <w:style w:type="character" w:styleId="ZitatZchn" w:customStyle="1">
+  <w:style w:type="character" w:customStyle="1" w:styleId="ZitatZchn">
     <w:name w:val="Zitat Zchn"/>
-    <w:basedOn w:val="DefaultParagraphFont"/>
-    <w:link w:val="Quote"/>
+    <w:basedOn w:val="Absatz-Standardschriftart"/>
+    <w:link w:val="Zitat"/>
     <w:uiPriority w:val="29"/>
     <w:qFormat/>
-    <w:rsid w:val="00a92bb9"/>
+    <w:rsid w:val="00A92BB9"/>
     <w:rPr>
       <w:rFonts w:ascii="Futura Lt BT" w:hAnsi="Futura Lt BT"/>
       <w:i/>
       <w:iCs/>
-      <w:color w:themeColor="text1" w:themeTint="bf" w:val="404040"/>
-    </w:rPr>
-  </w:style>
-  <w:style w:type="character" w:styleId="IntensivesZitatZchn" w:customStyle="1">
+      <w:color w:val="404040" w:themeColor="text1" w:themeTint="BF"/>
+    </w:rPr>
+  </w:style>
+  <w:style w:type="character" w:customStyle="1" w:styleId="IntensivesZitatZchn">
     <w:name w:val="Intensives Zitat Zchn"/>
-    <w:basedOn w:val="DefaultParagraphFont"/>
-    <w:link w:val="IntenseQuote"/>
+    <w:basedOn w:val="Absatz-Standardschriftart"/>
+    <w:link w:val="IntensivesZitat"/>
     <w:uiPriority w:val="30"/>
     <w:qFormat/>
-    <w:rsid w:val="00a92bb9"/>
+    <w:rsid w:val="00A92BB9"/>
     <w:rPr>
       <w:rFonts w:ascii="Futura Lt BT" w:hAnsi="Futura Lt BT"/>
       <w:i/>
       <w:iCs/>
-      <w:color w:themeColor="accent1" w:val="4472C4"/>
-    </w:rPr>
-  </w:style>
-  <w:style w:type="character" w:styleId="SubtleReference">
+      <w:color w:val="4472C4" w:themeColor="accent1"/>
+    </w:rPr>
+  </w:style>
+  <w:style w:type="character" w:styleId="SchwacherVerweis">
     <w:name w:val="Subtle Reference"/>
-    <w:basedOn w:val="DefaultParagraphFont"/>
+    <w:basedOn w:val="Absatz-Standardschriftart"/>
     <w:uiPriority w:val="31"/>
     <w:qFormat/>
-    <w:rsid w:val="00a92bb9"/>
+    <w:rsid w:val="00A92BB9"/>
     <w:rPr>
       <w:smallCaps/>
-      <w:color w:themeColor="text1" w:themeTint="a5" w:val="5A5A5A"/>
-    </w:rPr>
-  </w:style>
-  <w:style w:type="character" w:styleId="IntenseReference">
+      <w:color w:val="5A5A5A" w:themeColor="text1" w:themeTint="A5"/>
+    </w:rPr>
+  </w:style>
+  <w:style w:type="character" w:styleId="IntensiverVerweis">
     <w:name w:val="Intense Reference"/>
-    <w:basedOn w:val="DefaultParagraphFont"/>
+    <w:basedOn w:val="Absatz-Standardschriftart"/>
     <w:uiPriority w:val="32"/>
     <w:qFormat/>
-    <w:rsid w:val="00a92bb9"/>
+    <w:rsid w:val="00A92BB9"/>
     <w:rPr>
       <w:b/>
       <w:bCs/>
       <w:smallCaps/>
-      <w:color w:themeColor="accent1" w:val="4472C4"/>
+      <w:color w:val="4472C4" w:themeColor="accent1"/>
       <w:spacing w:val="5"/>
     </w:rPr>
   </w:style>
-  <w:style w:type="character" w:styleId="BookTitle">
+  <w:style w:type="character" w:styleId="Buchtitel">
     <w:name w:val="Book Title"/>
-    <w:basedOn w:val="DefaultParagraphFont"/>
+    <w:basedOn w:val="Absatz-Standardschriftart"/>
     <w:uiPriority w:val="33"/>
     <w:qFormat/>
-    <w:rsid w:val="00a92bb9"/>
+    <w:rsid w:val="00A92BB9"/>
     <w:rPr>
       <w:b/>
       <w:bCs/>
@@ -2402,33 +2432,33 @@
       <w:spacing w:val="5"/>
     </w:rPr>
   </w:style>
-  <w:style w:type="character" w:styleId="DokumentTitelZchn" w:customStyle="1">
+  <w:style w:type="character" w:customStyle="1" w:styleId="DokumentTitelZchn">
     <w:name w:val="DokumentTitel Zchn"/>
-    <w:basedOn w:val="DefaultParagraphFont"/>
+    <w:basedOn w:val="Absatz-Standardschriftart"/>
     <w:link w:val="DokumentTitel"/>
     <w:qFormat/>
-    <w:rsid w:val="00625b98"/>
+    <w:rsid w:val="00625B98"/>
     <w:rPr>
       <w:rFonts w:ascii="Futura Lt BT" w:hAnsi="Futura Lt BT"/>
       <w:b/>
       <w:sz w:val="28"/>
     </w:rPr>
   </w:style>
-  <w:style w:type="character" w:styleId="SourceCode" w:customStyle="1">
+  <w:style w:type="character" w:customStyle="1" w:styleId="SourceCode">
     <w:name w:val="Source Code"/>
     <w:basedOn w:val="HTMLCode"/>
     <w:uiPriority w:val="1"/>
     <w:qFormat/>
-    <w:rsid w:val="004d29b8"/>
+    <w:rsid w:val="004D29B8"/>
     <w:rPr>
       <w:rFonts w:ascii="Courier New" w:hAnsi="Courier New"/>
-      <w:b w:val="false"/>
-      <w:i w:val="false"/>
-      <w:caps w:val="false"/>
-      <w:smallCaps w:val="false"/>
-      <w:strike w:val="false"/>
-      <w:dstrike w:val="false"/>
-      <w:vanish w:val="false"/>
+      <w:b w:val="0"/>
+      <w:i w:val="0"/>
+      <w:caps w:val="0"/>
+      <w:smallCaps w:val="0"/>
+      <w:strike w:val="0"/>
+      <w:dstrike w:val="0"/>
+      <w:vanish w:val="0"/>
       <w:spacing w:val="0"/>
       <w:w w:val="100"/>
       <w:position w:val="0"/>
@@ -2441,71 +2471,68 @@
   </w:style>
   <w:style w:type="character" w:styleId="HTMLCode">
     <w:name w:val="HTML Code"/>
-    <w:basedOn w:val="DefaultParagraphFont"/>
+    <w:basedOn w:val="Absatz-Standardschriftart"/>
     <w:uiPriority w:val="99"/>
     <w:semiHidden/>
     <w:unhideWhenUsed/>
     <w:qFormat/>
-    <w:rsid w:val="004d29b8"/>
+    <w:rsid w:val="004D29B8"/>
     <w:rPr>
       <w:rFonts w:ascii="Consolas" w:hAnsi="Consolas"/>
       <w:sz w:val="20"/>
       <w:szCs w:val="20"/>
     </w:rPr>
   </w:style>
-  <w:style w:type="paragraph" w:styleId="berschrift">
+  <w:style w:type="paragraph" w:customStyle="1" w:styleId="berschrift">
     <w:name w:val="Überschrift"/>
-    <w:basedOn w:val="Normal"/>
-    <w:next w:val="BodyText"/>
+    <w:basedOn w:val="Standard"/>
+    <w:next w:val="Textkrper"/>
     <w:qFormat/>
     <w:pPr>
-      <w:keepNext w:val="true"/>
+      <w:keepNext/>
       <w:spacing w:before="240" w:after="120"/>
     </w:pPr>
     <w:rPr>
-      <w:rFonts w:ascii="Liberation Sans" w:hAnsi="Liberation Sans" w:eastAsia="Microsoft YaHei" w:cs="Lucida Sans"/>
+      <w:rFonts w:ascii="Liberation Sans" w:eastAsia="Microsoft YaHei" w:hAnsi="Liberation Sans" w:cs="Lucida Sans"/>
       <w:sz w:val="28"/>
-      <w:szCs w:val="28"/>
-    </w:rPr>
-  </w:style>
-  <w:style w:type="paragraph" w:styleId="BodyText">
+    </w:rPr>
+  </w:style>
+  <w:style w:type="paragraph" w:styleId="Textkrper">
     <w:name w:val="Body Text"/>
-    <w:basedOn w:val="Normal"/>
+    <w:basedOn w:val="Standard"/>
     <w:pPr>
-      <w:spacing w:lineRule="auto" w:line="276" w:before="0" w:after="140"/>
+      <w:spacing w:after="140" w:line="276" w:lineRule="auto"/>
     </w:pPr>
-    <w:rPr/>
-  </w:style>
-  <w:style w:type="paragraph" w:styleId="List">
+  </w:style>
+  <w:style w:type="paragraph" w:styleId="Liste">
     <w:name w:val="List"/>
-    <w:basedOn w:val="BodyText"/>
-    <w:pPr/>
+    <w:basedOn w:val="Textkrper"/>
     <w:rPr>
       <w:rFonts w:cs="Lucida Sans"/>
     </w:rPr>
   </w:style>
-  <w:style w:type="paragraph" w:styleId="Caption">
+  <w:style w:type="paragraph" w:styleId="Beschriftung">
     <w:name w:val="caption"/>
-    <w:basedOn w:val="Normal"/>
-    <w:next w:val="Normal"/>
+    <w:basedOn w:val="Standard"/>
+    <w:next w:val="Standard"/>
     <w:uiPriority w:val="35"/>
     <w:unhideWhenUsed/>
     <w:qFormat/>
-    <w:rsid w:val="009638a2"/>
+    <w:rsid w:val="009638A2"/>
     <w:pPr>
-      <w:spacing w:lineRule="auto" w:line="240" w:before="0" w:after="200"/>
+      <w:spacing w:after="200" w:line="240" w:lineRule="auto"/>
     </w:pPr>
     <w:rPr>
       <w:i/>
       <w:iCs/>
-      <w:color w:themeColor="text2" w:val="44546A"/>
+      <w:color w:val="44546A" w:themeColor="text2"/>
       <w:sz w:val="18"/>
       <w:szCs w:val="22"/>
     </w:rPr>
   </w:style>
-  <w:style w:type="paragraph" w:styleId="Verzeichnis">
+  <w:style w:type="paragraph" w:customStyle="1" w:styleId="Verzeichnis">
     <w:name w:val="Verzeichnis"/>
-    <w:basedOn w:val="Normal"/>
+    <w:basedOn w:val="Standard"/>
     <w:qFormat/>
     <w:pPr>
       <w:suppressLineNumbers/>
@@ -2514,58 +2541,52 @@
       <w:rFonts w:cs="Lucida Sans"/>
     </w:rPr>
   </w:style>
-  <w:style w:type="paragraph" w:styleId="Kopf-Fuzeile">
+  <w:style w:type="paragraph" w:customStyle="1" w:styleId="Kopf-Fuzeile">
     <w:name w:val="Kopf-/Fußzeile"/>
-    <w:basedOn w:val="Normal"/>
-    <w:qFormat/>
-    <w:pPr/>
-    <w:rPr/>
-  </w:style>
-  <w:style w:type="paragraph" w:styleId="Header">
+    <w:basedOn w:val="Standard"/>
+    <w:qFormat/>
+  </w:style>
+  <w:style w:type="paragraph" w:styleId="Kopfzeile">
     <w:name w:val="header"/>
-    <w:basedOn w:val="Normal"/>
+    <w:basedOn w:val="Standard"/>
     <w:link w:val="KopfzeileZchn"/>
     <w:uiPriority w:val="99"/>
     <w:unhideWhenUsed/>
-    <w:rsid w:val="004207bd"/>
+    <w:rsid w:val="004207BD"/>
     <w:pPr>
       <w:tabs>
-        <w:tab w:val="clear" w:pos="708"/>
-        <w:tab w:val="center" w:pos="4536" w:leader="none"/>
-        <w:tab w:val="right" w:pos="9072" w:leader="none"/>
+        <w:tab w:val="center" w:pos="4536"/>
+        <w:tab w:val="right" w:pos="9072"/>
       </w:tabs>
-      <w:spacing w:lineRule="auto" w:line="240" w:before="0" w:after="0"/>
+      <w:spacing w:after="0" w:line="240" w:lineRule="auto"/>
     </w:pPr>
-    <w:rPr/>
-  </w:style>
-  <w:style w:type="paragraph" w:styleId="Footer">
+  </w:style>
+  <w:style w:type="paragraph" w:styleId="Fuzeile">
     <w:name w:val="footer"/>
-    <w:basedOn w:val="Normal"/>
+    <w:basedOn w:val="Standard"/>
     <w:link w:val="FuzeileZchn"/>
     <w:uiPriority w:val="99"/>
     <w:unhideWhenUsed/>
-    <w:rsid w:val="004207bd"/>
+    <w:rsid w:val="004207BD"/>
     <w:pPr>
       <w:tabs>
-        <w:tab w:val="clear" w:pos="708"/>
-        <w:tab w:val="center" w:pos="4536" w:leader="none"/>
-        <w:tab w:val="right" w:pos="9072" w:leader="none"/>
+        <w:tab w:val="center" w:pos="4536"/>
+        <w:tab w:val="right" w:pos="9072"/>
       </w:tabs>
-      <w:spacing w:lineRule="auto" w:line="240" w:before="0" w:after="0"/>
+      <w:spacing w:after="0" w:line="240" w:lineRule="auto"/>
     </w:pPr>
-    <w:rPr/>
-  </w:style>
-  <w:style w:type="paragraph" w:styleId="BalloonText">
+  </w:style>
+  <w:style w:type="paragraph" w:styleId="Sprechblasentext">
     <w:name w:val="Balloon Text"/>
-    <w:basedOn w:val="Normal"/>
+    <w:basedOn w:val="Standard"/>
     <w:link w:val="SprechblasentextZchn"/>
     <w:uiPriority w:val="99"/>
     <w:semiHidden/>
     <w:unhideWhenUsed/>
     <w:qFormat/>
-    <w:rsid w:val="00ee5a9e"/>
+    <w:rsid w:val="00EE5A9E"/>
     <w:pPr>
-      <w:spacing w:lineRule="auto" w:line="240" w:before="0" w:after="0"/>
+      <w:spacing w:after="0" w:line="240" w:lineRule="auto"/>
     </w:pPr>
     <w:rPr>
       <w:rFonts w:ascii="Segoe UI" w:hAnsi="Segoe UI" w:cs="Angsana New"/>
@@ -2573,168 +2594,130 @@
       <w:szCs w:val="22"/>
     </w:rPr>
   </w:style>
-  <w:style w:type="paragraph" w:styleId="NoSpacing">
+  <w:style w:type="paragraph" w:styleId="KeinLeerraum">
     <w:name w:val="No Spacing"/>
     <w:uiPriority w:val="1"/>
     <w:qFormat/>
-    <w:rsid w:val="00a92bb9"/>
-    <w:pPr>
-      <w:widowControl/>
-      <w:bidi w:val="0"/>
-      <w:spacing w:lineRule="auto" w:line="240" w:before="0" w:after="0"/>
-      <w:jc w:val="start"/>
-    </w:pPr>
-    <w:rPr>
-      <w:rFonts w:ascii="Futura Lt BT" w:hAnsi="Futura Lt BT" w:eastAsia="Calibri" w:cs="Cordia New" w:cstheme="minorBidi" w:eastAsiaTheme="minorHAnsi"/>
-      <w:color w:val="auto"/>
-      <w:kern w:val="0"/>
-      <w:sz w:val="22"/>
-      <w:szCs w:val="28"/>
-      <w:lang w:val="de-DE" w:eastAsia="en-US" w:bidi="th-TH"/>
-    </w:rPr>
-  </w:style>
-  <w:style w:type="paragraph" w:styleId="Title">
+    <w:rsid w:val="00A92BB9"/>
+    <w:rPr>
+      <w:rFonts w:ascii="Futura Lt BT" w:hAnsi="Futura Lt BT"/>
+    </w:rPr>
+  </w:style>
+  <w:style w:type="paragraph" w:styleId="Titel">
     <w:name w:val="Title"/>
-    <w:basedOn w:val="Normal"/>
-    <w:next w:val="Normal"/>
+    <w:basedOn w:val="Standard"/>
+    <w:next w:val="Standard"/>
     <w:link w:val="TitelZchn"/>
     <w:uiPriority w:val="10"/>
     <w:qFormat/>
-    <w:rsid w:val="00a92bb9"/>
+    <w:rsid w:val="00A92BB9"/>
     <w:pPr>
-      <w:spacing w:lineRule="auto" w:line="240" w:before="0" w:after="0"/>
+      <w:spacing w:after="0" w:line="240" w:lineRule="auto"/>
       <w:contextualSpacing/>
     </w:pPr>
     <w:rPr>
-      <w:rFonts w:eastAsia="" w:cs="Angsana New" w:cstheme="majorBidi" w:eastAsiaTheme="majorEastAsia"/>
+      <w:rFonts w:eastAsiaTheme="majorEastAsia" w:cstheme="majorBidi"/>
       <w:spacing w:val="-10"/>
       <w:kern w:val="2"/>
       <w:sz w:val="56"/>
       <w:szCs w:val="71"/>
     </w:rPr>
   </w:style>
-  <w:style w:type="paragraph" w:styleId="Subtitle">
+  <w:style w:type="paragraph" w:styleId="Untertitel">
     <w:name w:val="Subtitle"/>
-    <w:basedOn w:val="Normal"/>
-    <w:next w:val="Normal"/>
+    <w:basedOn w:val="Standard"/>
+    <w:next w:val="Standard"/>
     <w:link w:val="UntertitelZchn"/>
     <w:uiPriority w:val="11"/>
     <w:qFormat/>
-    <w:rsid w:val="00a92bb9"/>
-    <w:pPr/>
-    <w:rPr>
-      <w:rFonts w:eastAsia="" w:eastAsiaTheme="minorEastAsia"/>
-      <w:color w:themeColor="text1" w:themeTint="a5" w:val="5A5A5A"/>
+    <w:rsid w:val="00A92BB9"/>
+    <w:rPr>
+      <w:rFonts w:eastAsiaTheme="minorEastAsia"/>
+      <w:color w:val="5A5A5A" w:themeColor="text1" w:themeTint="A5"/>
       <w:spacing w:val="15"/>
     </w:rPr>
   </w:style>
-  <w:style w:type="paragraph" w:styleId="Quote">
+  <w:style w:type="paragraph" w:styleId="Zitat">
     <w:name w:val="Quote"/>
-    <w:basedOn w:val="Normal"/>
-    <w:next w:val="Normal"/>
+    <w:basedOn w:val="Standard"/>
+    <w:next w:val="Standard"/>
     <w:link w:val="ZitatZchn"/>
     <w:uiPriority w:val="29"/>
     <w:qFormat/>
-    <w:rsid w:val="00a92bb9"/>
+    <w:rsid w:val="00A92BB9"/>
     <w:pPr>
-      <w:spacing w:before="200" w:after="160"/>
-      <w:ind w:start="864" w:end="864"/>
+      <w:spacing w:before="200"/>
+      <w:ind w:left="864" w:right="864"/>
       <w:jc w:val="center"/>
     </w:pPr>
     <w:rPr>
       <w:i/>
       <w:iCs/>
-      <w:color w:themeColor="text1" w:themeTint="bf" w:val="404040"/>
-    </w:rPr>
-  </w:style>
-  <w:style w:type="paragraph" w:styleId="IntenseQuote">
+      <w:color w:val="404040" w:themeColor="text1" w:themeTint="BF"/>
+    </w:rPr>
+  </w:style>
+  <w:style w:type="paragraph" w:styleId="IntensivesZitat">
     <w:name w:val="Intense Quote"/>
-    <w:basedOn w:val="Normal"/>
-    <w:next w:val="Normal"/>
+    <w:basedOn w:val="Standard"/>
+    <w:next w:val="Standard"/>
     <w:link w:val="IntensivesZitatZchn"/>
     <w:uiPriority w:val="30"/>
     <w:qFormat/>
-    <w:rsid w:val="00a92bb9"/>
+    <w:rsid w:val="00A92BB9"/>
     <w:pPr>
       <w:pBdr>
         <w:top w:val="single" w:sz="4" w:space="10" w:color="4472C4" w:themeColor="accent1"/>
         <w:bottom w:val="single" w:sz="4" w:space="10" w:color="4472C4" w:themeColor="accent1"/>
       </w:pBdr>
       <w:spacing w:before="360" w:after="360"/>
-      <w:ind w:start="864" w:end="864"/>
+      <w:ind w:left="864" w:right="864"/>
       <w:jc w:val="center"/>
     </w:pPr>
     <w:rPr>
       <w:i/>
       <w:iCs/>
-      <w:color w:themeColor="accent1" w:val="4472C4"/>
-    </w:rPr>
-  </w:style>
-  <w:style w:type="paragraph" w:styleId="ListParagraph">
+      <w:color w:val="4472C4" w:themeColor="accent1"/>
+    </w:rPr>
+  </w:style>
+  <w:style w:type="paragraph" w:styleId="Listenabsatz">
     <w:name w:val="List Paragraph"/>
-    <w:basedOn w:val="Normal"/>
+    <w:basedOn w:val="Standard"/>
     <w:uiPriority w:val="34"/>
     <w:qFormat/>
-    <w:rsid w:val="00a92bb9"/>
+    <w:rsid w:val="00A92BB9"/>
     <w:pPr>
-      <w:spacing w:before="0" w:after="160"/>
-      <w:ind w:start="720"/>
+      <w:ind w:left="720"/>
       <w:contextualSpacing/>
     </w:pPr>
-    <w:rPr/>
-  </w:style>
-  <w:style w:type="paragraph" w:styleId="DokumentTitel" w:customStyle="1">
+  </w:style>
+  <w:style w:type="paragraph" w:customStyle="1" w:styleId="DokumentTitel">
     <w:name w:val="DokumentTitel"/>
-    <w:basedOn w:val="Normal"/>
+    <w:basedOn w:val="Standard"/>
     <w:link w:val="DokumentTitelZchn"/>
     <w:qFormat/>
-    <w:rsid w:val="00625b98"/>
+    <w:rsid w:val="00625B98"/>
     <w:pPr>
-      <w:spacing w:lineRule="auto" w:line="360"/>
+      <w:spacing w:line="360" w:lineRule="auto"/>
       <w:jc w:val="center"/>
     </w:pPr>
     <w:rPr>
       <w:b/>
       <w:sz w:val="28"/>
     </w:rPr>
-  </w:style>
-  <w:style w:type="numbering" w:styleId="KeineListe" w:default="1">
-    <w:name w:val="Keine Liste"/>
-    <w:uiPriority w:val="99"/>
-    <w:semiHidden/>
-    <w:unhideWhenUsed/>
-    <w:qFormat/>
-  </w:style>
-  <w:style w:type="table" w:default="1" w:styleId="NormaleTabelle">
-    <w:name w:val="Normal Table"/>
-    <w:uiPriority w:val="99"/>
-    <w:semiHidden/>
-    <w:unhideWhenUsed/>
-    <w:tblPr>
-      <w:tblCellMar>
-        <w:top w:w="0" w:type="dxa"/>
-        <w:left w:w="108" w:type="dxa"/>
-        <w:bottom w:w="0" w:type="dxa"/>
-        <w:right w:w="108" w:type="dxa"/>
-      </w:tblCellMar>
-    </w:tblPr>
   </w:style>
   <w:style w:type="table" w:styleId="Tabellenraster">
     <w:name w:val="Table Grid"/>
     <w:basedOn w:val="NormaleTabelle"/>
     <w:uiPriority w:val="39"/>
-    <w:rsid w:val="00ee5a9e"/>
-    <w:pPr>
-      <w:spacing w:after="0" w:line="240" w:lineRule="auto"/>
-    </w:pPr>
+    <w:rsid w:val="00EE5A9E"/>
     <w:tblPr>
       <w:tblBorders>
-        <w:top w:val="single" w:color="auto" w:sz="4" w:space="0"/>
-        <w:left w:val="single" w:color="auto" w:sz="4" w:space="0"/>
-        <w:bottom w:val="single" w:color="auto" w:sz="4" w:space="0"/>
-        <w:right w:val="single" w:color="auto" w:sz="4" w:space="0"/>
-        <w:insideH w:val="single" w:color="auto" w:sz="4" w:space="0"/>
-        <w:insideV w:val="single" w:color="auto" w:sz="4" w:space="0"/>
+        <w:top w:val="single" w:sz="4" w:space="0" w:color="auto"/>
+        <w:left w:val="single" w:sz="4" w:space="0" w:color="auto"/>
+        <w:bottom w:val="single" w:sz="4" w:space="0" w:color="auto"/>
+        <w:right w:val="single" w:sz="4" w:space="0" w:color="auto"/>
+        <w:insideH w:val="single" w:sz="4" w:space="0" w:color="auto"/>
+        <w:insideV w:val="single" w:sz="4" w:space="0" w:color="auto"/>
       </w:tblBorders>
     </w:tblPr>
   </w:style>
@@ -2742,54 +2725,54 @@
 </file>
 
 <file path=word/theme/theme1.xml><?xml version="1.0" encoding="utf-8"?>
-<a:theme xmlns:a="http://schemas.openxmlformats.org/drawingml/2006/main" xmlns:r="http://schemas.openxmlformats.org/officeDocument/2006/relationships" name="Office">
+<a:theme xmlns:a="http://schemas.openxmlformats.org/drawingml/2006/main" name="Office">
   <a:themeElements>
     <a:clrScheme name="Office">
       <a:dk1>
         <a:srgbClr val="000000"/>
       </a:dk1>
       <a:lt1>
-        <a:srgbClr val="ffffff"/>
+        <a:srgbClr val="FFFFFF"/>
       </a:lt1>
       <a:dk2>
-        <a:srgbClr val="44546a"/>
+        <a:srgbClr val="44546A"/>
       </a:dk2>
       <a:lt2>
-        <a:srgbClr val="e7e6e6"/>
+        <a:srgbClr val="E7E6E6"/>
       </a:lt2>
       <a:accent1>
-        <a:srgbClr val="4472c4"/>
+        <a:srgbClr val="4472C4"/>
       </a:accent1>
       <a:accent2>
-        <a:srgbClr val="ed7d31"/>
+        <a:srgbClr val="ED7D31"/>
       </a:accent2>
       <a:accent3>
-        <a:srgbClr val="a5a5a5"/>
+        <a:srgbClr val="A5A5A5"/>
       </a:accent3>
       <a:accent4>
-        <a:srgbClr val="ffc000"/>
+        <a:srgbClr val="FFC000"/>
       </a:accent4>
       <a:accent5>
-        <a:srgbClr val="5b9bd5"/>
+        <a:srgbClr val="5B9BD5"/>
       </a:accent5>
       <a:accent6>
-        <a:srgbClr val="70ad47"/>
+        <a:srgbClr val="70AD47"/>
       </a:accent6>
       <a:hlink>
-        <a:srgbClr val="0563c1"/>
+        <a:srgbClr val="0563C1"/>
       </a:hlink>
       <a:folHlink>
-        <a:srgbClr val="954f72"/>
+        <a:srgbClr val="954F72"/>
       </a:folHlink>
     </a:clrScheme>
     <a:fontScheme name="Office">
       <a:majorFont>
-        <a:latin typeface="Calibri Light" panose="020F0302020204030204" pitchFamily="0" charset="1"/>
+        <a:latin typeface="Calibri Light" panose="020F0302020204030204"/>
         <a:ea typeface=""/>
         <a:cs typeface=""/>
       </a:majorFont>
       <a:minorFont>
-        <a:latin typeface="Calibri" panose="020F0502020204030204" pitchFamily="0" charset="1"/>
+        <a:latin typeface="Calibri" panose="020F0502020204030204"/>
         <a:ea typeface=""/>
         <a:cs typeface=""/>
       </a:minorFont>
@@ -2821,7 +2804,7 @@
             </a:gs>
           </a:gsLst>
           <a:lin ang="5400000" scaled="0"/>
-          <a:tileRect l="0" t="0" r="0" b="0"/>
+          <a:tileRect/>
         </a:gradFill>
         <a:gradFill>
           <a:gsLst>
@@ -2845,7 +2828,7 @@
             </a:gs>
           </a:gsLst>
           <a:lin ang="5400000" scaled="0"/>
-          <a:tileRect l="0" t="0" r="0" b="0"/>
+          <a:tileRect/>
         </a:gradFill>
       </a:fillStyleLst>
       <a:lnStyleLst>
@@ -2905,11 +2888,13 @@
             </a:gs>
           </a:gsLst>
           <a:lin ang="5400000" scaled="0"/>
-          <a:tileRect l="0" t="0" r="0" b="0"/>
+          <a:tileRect/>
         </a:gradFill>
       </a:bgFillStyleLst>
     </a:fmtScheme>
   </a:themeElements>
+  <a:objectDefaults/>
+  <a:extraClrSchemeLst/>
 </a:theme>
 </file>
 
@@ -2918,7 +2903,7 @@
 </file>
 
 <file path=customXml/itemProps1.xml><?xml version="1.0" encoding="utf-8"?>
-<ds:datastoreItem xmlns:ds="http://schemas.openxmlformats.org/officeDocument/2006/customXml" ds:itemID="{E92C8452-F6F5-4BCC-9908-C619F28A488A}">
+<ds:datastoreItem xmlns:ds="http://schemas.openxmlformats.org/officeDocument/2006/customXml" ds:itemID="{61E6AE06-2A0D-4753-A1C0-FFDDA3FE2C0B}">
   <ds:schemaRefs>
     <ds:schemaRef ds:uri="http://schemas.openxmlformats.org/officeDocument/2006/bibliography"/>
   </ds:schemaRefs>

</xml_diff>